<commit_message>
Modernize downloadable resume layout
</commit_message>
<xml_diff>
--- a/AnkitParekh_Resume.docx
+++ b/AnkitParekh_Resume.docx
@@ -2,118 +2,719 @@
 <file path=word/document.xml><?xml version="1.0" encoding="utf-8"?>
 <w:document xmlns:wpc="http://schemas.microsoft.com/office/word/2010/wordprocessingCanvas" xmlns:mo="http://schemas.microsoft.com/office/mac/office/2008/main" xmlns:mc="http://schemas.openxmlformats.org/markup-compatibility/2006" xmlns:mv="urn:schemas-microsoft-com:mac:vml" xmlns:o="urn:schemas-microsoft-com:office:office" xmlns:r="http://schemas.openxmlformats.org/officeDocument/2006/relationships" xmlns:m="http://schemas.openxmlformats.org/officeDocument/2006/math" xmlns:v="urn:schemas-microsoft-com:vml" xmlns:wp14="http://schemas.microsoft.com/office/word/2010/wordprocessingDrawing" xmlns:wp="http://schemas.openxmlformats.org/drawingml/2006/wordprocessingDrawing" xmlns:w10="urn:schemas-microsoft-com:office:word" xmlns:w="http://schemas.openxmlformats.org/wordprocessingml/2006/main" xmlns:w14="http://schemas.microsoft.com/office/word/2010/wordml" xmlns:wpg="http://schemas.microsoft.com/office/word/2010/wordprocessingGroup" xmlns:wpi="http://schemas.microsoft.com/office/word/2010/wordprocessingInk" xmlns:wne="http://schemas.microsoft.com/office/word/2006/wordml" xmlns:wps="http://schemas.microsoft.com/office/word/2010/wordprocessingShape" mc:Ignorable="w14 wp14">
   <w:body>
+    <w:tbl>
+      <w:tblPr>
+        <w:tblW w:type="auto" w:w="0"/>
+        <w:tblLayout w:type="fixed"/>
+        <w:tblLook w:firstColumn="1" w:firstRow="1" w:lastColumn="0" w:lastRow="0" w:noHBand="0" w:noVBand="1" w:val="04A0"/>
+      </w:tblPr>
+      <w:tblGrid>
+        <w:gridCol w:w="2952"/>
+        <w:gridCol w:w="7344"/>
+      </w:tblGrid>
+      <w:tr>
+        <w:tc>
+          <w:tcPr>
+            <w:tcW w:type="dxa" w:w="2952"/>
+            <w:vAlign w:val="top"/>
+            <w:shd w:fill="0D5A4A"/>
+          </w:tcPr>
+          <w:p>
+            <w:pPr>
+              <w:jc w:val="center"/>
+            </w:pPr>
+            <w:r>
+              <w:rPr>
+                <w:b/>
+                <w:color w:val="FFFFFF"/>
+                <w:sz w:val="38"/>
+              </w:rPr>
+              <w:t>Ankit Parekh</w:t>
+            </w:r>
+          </w:p>
+          <w:p>
+            <w:pPr>
+              <w:jc w:val="center"/>
+            </w:pPr>
+            <w:r>
+              <w:rPr>
+                <w:b/>
+                <w:color w:val="DCEFE9"/>
+                <w:sz w:val="18"/>
+              </w:rPr>
+              <w:t>AI Frontend Architect</w:t>
+            </w:r>
+          </w:p>
+          <w:p>
+            <w:pPr>
+              <w:jc w:val="center"/>
+            </w:pPr>
+            <w:r>
+              <w:rPr>
+                <w:color w:val="E8F5F1"/>
+                <w:sz w:val="15"/>
+              </w:rPr>
+              <w:t>Enterprise Angular | Copilots | UI Agents | LLM Apps</w:t>
+            </w:r>
+          </w:p>
+          <w:p>
+            <w:pPr>
+              <w:spacing w:before="160" w:after="40"/>
+            </w:pPr>
+            <w:r>
+              <w:rPr>
+                <w:b/>
+                <w:color w:val="FFFFFF"/>
+                <w:sz w:val="19"/>
+              </w:rPr>
+              <w:t>DETAILS</w:t>
+            </w:r>
+          </w:p>
+          <w:p>
+            <w:r>
+              <w:rPr>
+                <w:color w:val="E8F5F1"/>
+                <w:sz w:val="15"/>
+              </w:rPr>
+              <w:t>Mumbai, India</w:t>
+            </w:r>
+          </w:p>
+          <w:p>
+            <w:r>
+              <w:rPr>
+                <w:color w:val="E8F5F1"/>
+                <w:sz w:val="15"/>
+              </w:rPr>
+              <w:t>Immediate joiner</w:t>
+            </w:r>
+          </w:p>
+          <w:p>
+            <w:r>
+              <w:rPr>
+                <w:color w:val="E8F5F1"/>
+                <w:sz w:val="15"/>
+              </w:rPr>
+              <w:t>Open to Germany, Ireland, and remote Europe roles</w:t>
+            </w:r>
+          </w:p>
+          <w:p>
+            <w:r>
+              <w:rPr>
+                <w:color w:val="E8F5F1"/>
+                <w:sz w:val="15"/>
+              </w:rPr>
+              <w:t>ankit77parekh@gmail.com</w:t>
+            </w:r>
+          </w:p>
+          <w:p>
+            <w:r>
+              <w:rPr>
+                <w:color w:val="E8F5F1"/>
+                <w:sz w:val="15"/>
+              </w:rPr>
+              <w:t>+91 9920353532</w:t>
+            </w:r>
+          </w:p>
+          <w:p>
+            <w:pPr>
+              <w:spacing w:before="160" w:after="40"/>
+            </w:pPr>
+            <w:r>
+              <w:rPr>
+                <w:b/>
+                <w:color w:val="FFFFFF"/>
+                <w:sz w:val="19"/>
+              </w:rPr>
+              <w:t>LINKS</w:t>
+            </w:r>
+          </w:p>
+          <w:p>
+            <w:hyperlink r:id="rId9">
+              <w:r>
+                <w:rPr>
+                  <w:color w:val="FFFFFF"/>
+                  <w:u w:val="single"/>
+                </w:rPr>
+                <w:t>Portfolio</w:t>
+              </w:r>
+            </w:hyperlink>
+          </w:p>
+          <w:p>
+            <w:hyperlink r:id="rId10">
+              <w:r>
+                <w:rPr>
+                  <w:color w:val="FFFFFF"/>
+                  <w:u w:val="single"/>
+                </w:rPr>
+                <w:t>GitHub</w:t>
+              </w:r>
+            </w:hyperlink>
+          </w:p>
+          <w:p>
+            <w:hyperlink r:id="rId11">
+              <w:r>
+                <w:rPr>
+                  <w:color w:val="FFFFFF"/>
+                  <w:u w:val="single"/>
+                </w:rPr>
+                <w:t>LinkedIn</w:t>
+              </w:r>
+            </w:hyperlink>
+          </w:p>
+          <w:p>
+            <w:pPr>
+              <w:spacing w:before="160" w:after="40"/>
+            </w:pPr>
+            <w:r>
+              <w:rPr>
+                <w:b/>
+                <w:color w:val="FFFFFF"/>
+                <w:sz w:val="19"/>
+              </w:rPr>
+              <w:t>SKILL FOCUS</w:t>
+            </w:r>
+          </w:p>
+          <w:p>
+            <w:r>
+              <w:rPr>
+                <w:color w:val="FFFFFF"/>
+                <w:sz w:val="15"/>
+              </w:rPr>
+              <w:t>Angular</w:t>
+            </w:r>
+          </w:p>
+          <w:p>
+            <w:r>
+              <w:rPr>
+                <w:color w:val="E8F5F1"/>
+                <w:sz w:val="12"/>
+              </w:rPr>
+              <w:t>■■■■■■■■■□</w:t>
+            </w:r>
+          </w:p>
+          <w:p>
+            <w:r>
+              <w:rPr>
+                <w:color w:val="FFFFFF"/>
+                <w:sz w:val="15"/>
+              </w:rPr>
+              <w:t>TypeScript</w:t>
+            </w:r>
+          </w:p>
+          <w:p>
+            <w:r>
+              <w:rPr>
+                <w:color w:val="E8F5F1"/>
+                <w:sz w:val="12"/>
+              </w:rPr>
+              <w:t>■■■■■■■■■□</w:t>
+            </w:r>
+          </w:p>
+          <w:p>
+            <w:r>
+              <w:rPr>
+                <w:color w:val="FFFFFF"/>
+                <w:sz w:val="15"/>
+              </w:rPr>
+              <w:t>Frontend Architecture</w:t>
+            </w:r>
+          </w:p>
+          <w:p>
+            <w:r>
+              <w:rPr>
+                <w:color w:val="E8F5F1"/>
+                <w:sz w:val="12"/>
+              </w:rPr>
+              <w:t>■■■■■■■■■□</w:t>
+            </w:r>
+          </w:p>
+          <w:p>
+            <w:r>
+              <w:rPr>
+                <w:color w:val="FFFFFF"/>
+                <w:sz w:val="15"/>
+              </w:rPr>
+              <w:t>AI Copilots</w:t>
+            </w:r>
+          </w:p>
+          <w:p>
+            <w:r>
+              <w:rPr>
+                <w:color w:val="E8F5F1"/>
+                <w:sz w:val="12"/>
+              </w:rPr>
+              <w:t>■■■■■■■■□□</w:t>
+            </w:r>
+          </w:p>
+          <w:p>
+            <w:r>
+              <w:rPr>
+                <w:color w:val="FFFFFF"/>
+                <w:sz w:val="15"/>
+              </w:rPr>
+              <w:t>RAG / LLM Apps</w:t>
+            </w:r>
+          </w:p>
+          <w:p>
+            <w:r>
+              <w:rPr>
+                <w:color w:val="E8F5F1"/>
+                <w:sz w:val="12"/>
+              </w:rPr>
+              <w:t>■■■■■■■■□□</w:t>
+            </w:r>
+          </w:p>
+          <w:p>
+            <w:r>
+              <w:rPr>
+                <w:color w:val="FFFFFF"/>
+                <w:sz w:val="15"/>
+              </w:rPr>
+              <w:t>Cloud Delivery</w:t>
+            </w:r>
+          </w:p>
+          <w:p>
+            <w:r>
+              <w:rPr>
+                <w:color w:val="E8F5F1"/>
+                <w:sz w:val="12"/>
+              </w:rPr>
+              <w:t>■■■■■■■□□□</w:t>
+            </w:r>
+          </w:p>
+          <w:p>
+            <w:pPr>
+              <w:spacing w:before="160" w:after="40"/>
+            </w:pPr>
+            <w:r>
+              <w:rPr>
+                <w:b/>
+                <w:color w:val="FFFFFF"/>
+                <w:sz w:val="19"/>
+              </w:rPr>
+              <w:t>ROLE TARGETS</w:t>
+            </w:r>
+          </w:p>
+          <w:p>
+            <w:r>
+              <w:rPr>
+                <w:color w:val="E8F5F1"/>
+                <w:sz w:val="15"/>
+              </w:rPr>
+              <w:t>AI Frontend Engineer</w:t>
+            </w:r>
+          </w:p>
+          <w:p>
+            <w:r>
+              <w:rPr>
+                <w:color w:val="E8F5F1"/>
+                <w:sz w:val="15"/>
+              </w:rPr>
+              <w:t>Frontend Architect</w:t>
+            </w:r>
+          </w:p>
+          <w:p>
+            <w:r>
+              <w:rPr>
+                <w:color w:val="E8F5F1"/>
+                <w:sz w:val="15"/>
+              </w:rPr>
+              <w:t>Angular Architect</w:t>
+            </w:r>
+          </w:p>
+          <w:p>
+            <w:r>
+              <w:rPr>
+                <w:color w:val="E8F5F1"/>
+                <w:sz w:val="15"/>
+              </w:rPr>
+              <w:t>Copilot / LLM App Engineer</w:t>
+            </w:r>
+          </w:p>
+        </w:tc>
+        <w:tc>
+          <w:tcPr>
+            <w:tcW w:type="dxa" w:w="7344"/>
+            <w:vAlign w:val="top"/>
+          </w:tcPr>
+          <w:p>
+            <w:r>
+              <w:rPr>
+                <w:b/>
+                <w:color w:val="171717"/>
+                <w:sz w:val="44"/>
+              </w:rPr>
+              <w:t>Ankit Parekh</w:t>
+            </w:r>
+          </w:p>
+          <w:p>
+            <w:r>
+              <w:rPr>
+                <w:b/>
+                <w:color w:val="60656F"/>
+                <w:sz w:val="19"/>
+              </w:rPr>
+              <w:t>AI Frontend Architect - Enterprise Angular | Copilots | UI Agents | LLM Apps</w:t>
+            </w:r>
+          </w:p>
+          <w:p>
+            <w:pPr>
+              <w:spacing w:before="140" w:after="40"/>
+            </w:pPr>
+            <w:r>
+              <w:rPr>
+                <w:b/>
+                <w:color w:val="0D5A4A"/>
+                <w:sz w:val="20"/>
+              </w:rPr>
+              <w:t>PROFILE</w:t>
+            </w:r>
+          </w:p>
+          <w:p>
+            <w:r>
+              <w:t>AI Frontend Architect with 18+ years of experience shipping enterprise web products, large Angular and TypeScript applications, and intelligent UI systems. I build AI-native frontend experiences where copilots, RAG, tool execution, and agentic workflows live inside real applications, not beside them.</w:t>
+            </w:r>
+          </w:p>
+          <w:p>
+            <w:pPr>
+              <w:pStyle w:val="ListBullet"/>
+              <w:spacing w:after="24"/>
+            </w:pPr>
+            <w:r>
+              <w:t>Architect large Angular platforms with clear module boundaries, reusable UI patterns, and long-term ownership.</w:t>
+            </w:r>
+          </w:p>
+          <w:p>
+            <w:pPr>
+              <w:pStyle w:val="ListBullet"/>
+              <w:spacing w:after="24"/>
+            </w:pPr>
+            <w:r>
+              <w:t>Design embedded copilots that understand product context, retrieve grounded answers, and execute workflow actions.</w:t>
+            </w:r>
+          </w:p>
+          <w:p>
+            <w:pPr>
+              <w:pStyle w:val="ListBullet"/>
+              <w:spacing w:after="24"/>
+            </w:pPr>
+            <w:r>
+              <w:t>Turn complex enterprise workflows into usable interfaces across dense forms, tables, dashboards, and operational UI.</w:t>
+            </w:r>
+          </w:p>
+          <w:p>
+            <w:pPr>
+              <w:pStyle w:val="ListBullet"/>
+              <w:spacing w:after="24"/>
+            </w:pPr>
+            <w:r>
+              <w:t>Lead delivery across product, frontend, DevOps, and platform teams with production sustainment discipline.</w:t>
+            </w:r>
+          </w:p>
+          <w:p>
+            <w:pPr>
+              <w:spacing w:before="140" w:after="40"/>
+            </w:pPr>
+            <w:r>
+              <w:rPr>
+                <w:b/>
+                <w:color w:val="0D5A4A"/>
+                <w:sz w:val="20"/>
+              </w:rPr>
+              <w:t>AI FRONTEND WORK</w:t>
+            </w:r>
+          </w:p>
+          <w:p>
+            <w:pPr>
+              <w:spacing w:before="80"/>
+            </w:pPr>
+            <w:r>
+              <w:rPr>
+                <w:b/>
+              </w:rPr>
+              <w:t>Embedded Copilot for Enterprise Apps</w:t>
+            </w:r>
+          </w:p>
+          <w:p>
+            <w:pPr>
+              <w:pStyle w:val="ListBullet"/>
+              <w:spacing w:after="24"/>
+            </w:pPr>
+            <w:r>
+              <w:t>Copilot concept for Angular and web apps that understands routes, selected records, forms, DOM context, and user intent.</w:t>
+            </w:r>
+          </w:p>
+          <w:p>
+            <w:pPr>
+              <w:pStyle w:val="ListBullet"/>
+              <w:spacing w:after="24"/>
+            </w:pPr>
+            <w:r>
+              <w:t>Multi-agent modes for plan, execute, debug, and ask workflows.</w:t>
+            </w:r>
+          </w:p>
+          <w:p>
+            <w:pPr>
+              <w:pStyle w:val="ListBullet"/>
+              <w:spacing w:after="24"/>
+            </w:pPr>
+            <w:r>
+              <w:t>RAG across docs, codebase knowledge, APIs, and workflows to ground responses in product context.</w:t>
+            </w:r>
+          </w:p>
+          <w:p>
+            <w:pPr>
+              <w:pStyle w:val="ListBullet"/>
+              <w:spacing w:after="24"/>
+            </w:pPr>
+            <w:r>
+              <w:t>Action execution through APIs, navigation, workflow tools, evaluation loops, retries, and recovery paths.</w:t>
+            </w:r>
+          </w:p>
+          <w:p>
+            <w:pPr>
+              <w:spacing w:before="80"/>
+            </w:pPr>
+            <w:r>
+              <w:rPr>
+                <w:b/>
+              </w:rPr>
+              <w:t>Copilot Runtime and SDK Direction</w:t>
+            </w:r>
+          </w:p>
+          <w:p>
+            <w:pPr>
+              <w:pStyle w:val="ListBullet"/>
+              <w:spacing w:after="24"/>
+            </w:pPr>
+            <w:r>
+              <w:t>Reusable architecture for a copilot shell, agent orchestrator, tool registry, ingestion connectors, and enterprise-safe action execution.</w:t>
+            </w:r>
+          </w:p>
+          <w:p>
+            <w:pPr>
+              <w:pStyle w:val="ListBullet"/>
+              <w:spacing w:after="24"/>
+            </w:pPr>
+            <w:r>
+              <w:t>Designed for teams that want AI-native behavior inside Angular and TypeScript products without one-off integrations.</w:t>
+            </w:r>
+          </w:p>
+          <w:p>
+            <w:pPr>
+              <w:spacing w:before="140" w:after="40"/>
+            </w:pPr>
+            <w:r>
+              <w:rPr>
+                <w:b/>
+                <w:color w:val="0D5A4A"/>
+                <w:sz w:val="20"/>
+              </w:rPr>
+              <w:t>EMPLOYMENT HISTORY</w:t>
+            </w:r>
+          </w:p>
+          <w:p>
+            <w:pPr>
+              <w:spacing w:before="80"/>
+            </w:pPr>
+            <w:r>
+              <w:rPr>
+                <w:b/>
+              </w:rPr>
+              <w:t>Team Lead, Codifyd</w:t>
+            </w:r>
+            <w:r>
+              <w:t xml:space="preserve"> | 2018 - Present</w:t>
+            </w:r>
+          </w:p>
+          <w:p>
+            <w:pPr>
+              <w:pStyle w:val="ListBullet"/>
+              <w:spacing w:after="24"/>
+            </w:pPr>
+            <w:r>
+              <w:t>Own technical direction for enterprise web products, including stack fit, integration contracts, frontend architecture, and delivery trade-offs.</w:t>
+            </w:r>
+          </w:p>
+          <w:p>
+            <w:pPr>
+              <w:pStyle w:val="ListBullet"/>
+              <w:spacing w:after="24"/>
+            </w:pPr>
+            <w:r>
+              <w:t>Define system boundaries for large multi-module web applications and sustain production codebases through refactors, regression control, and release coordination.</w:t>
+            </w:r>
+          </w:p>
+          <w:p>
+            <w:pPr>
+              <w:pStyle w:val="ListBullet"/>
+              <w:spacing w:after="24"/>
+            </w:pPr>
+            <w:r>
+              <w:t>Create wireframes, interaction flows, and reusable UI patterns to align product intent with engineering constraints.</w:t>
+            </w:r>
+          </w:p>
+          <w:p>
+            <w:pPr>
+              <w:pStyle w:val="ListBullet"/>
+              <w:spacing w:after="24"/>
+            </w:pPr>
+            <w:r>
+              <w:t>Partner with DevOps and platform teams on CI/CD, build tooling, environment-specific defects, and cross-stack troubleshooting.</w:t>
+            </w:r>
+          </w:p>
+          <w:p>
+            <w:pPr>
+              <w:spacing w:before="80"/>
+            </w:pPr>
+            <w:r>
+              <w:rPr>
+                <w:b/>
+              </w:rPr>
+              <w:t>Front-end Expert, Zooty.in</w:t>
+            </w:r>
+            <w:r>
+              <w:t xml:space="preserve"> | 2016 - 2018</w:t>
+            </w:r>
+          </w:p>
+          <w:p>
+            <w:pPr>
+              <w:pStyle w:val="ListBullet"/>
+              <w:spacing w:after="24"/>
+            </w:pPr>
+            <w:r>
+              <w:t>Steered frontend implementation strategy, dependencies, sequencing, and UI architecture for customer-facing web products.</w:t>
+            </w:r>
+          </w:p>
+          <w:p>
+            <w:pPr>
+              <w:pStyle w:val="ListBullet"/>
+              <w:spacing w:after="24"/>
+            </w:pPr>
+            <w:r>
+              <w:t>Designed component boundaries, state ownership, interaction flows, and maintainable UI structure.</w:t>
+            </w:r>
+          </w:p>
+          <w:p>
+            <w:pPr>
+              <w:pStyle w:val="ListBullet"/>
+              <w:spacing w:after="24"/>
+            </w:pPr>
+            <w:r>
+              <w:t>Owned UX outcomes, defect triage, performance hotspots, and incremental hardening of live systems.</w:t>
+            </w:r>
+          </w:p>
+          <w:p>
+            <w:pPr>
+              <w:spacing w:before="80"/>
+            </w:pPr>
+            <w:r>
+              <w:rPr>
+                <w:b/>
+              </w:rPr>
+              <w:t>Lead Front-end Programmer, Musafir.com</w:t>
+            </w:r>
+            <w:r>
+              <w:t xml:space="preserve"> | 2015 - 2016</w:t>
+            </w:r>
+          </w:p>
+          <w:p>
+            <w:pPr>
+              <w:pStyle w:val="ListBullet"/>
+              <w:spacing w:after="24"/>
+            </w:pPr>
+            <w:r>
+              <w:t>Implemented and reviewed production UI for high-traffic travel workflows including search, pricing, booking, and checkout surfaces.</w:t>
+            </w:r>
+          </w:p>
+          <w:p>
+            <w:pPr>
+              <w:pStyle w:val="ListBullet"/>
+              <w:spacing w:after="24"/>
+            </w:pPr>
+            <w:r>
+              <w:t>Resolved complex rendering, layout, and performance issues under real traffic and data-load conditions.</w:t>
+            </w:r>
+          </w:p>
+          <w:p>
+            <w:pPr>
+              <w:spacing w:before="80"/>
+            </w:pPr>
+            <w:r>
+              <w:rPr>
+                <w:b/>
+              </w:rPr>
+              <w:t>Senior Front-end Developer, Verdantis Pvt Ltd.</w:t>
+            </w:r>
+            <w:r>
+              <w:t xml:space="preserve"> | 2014 - 2015</w:t>
+            </w:r>
+          </w:p>
+          <w:p>
+            <w:pPr>
+              <w:pStyle w:val="ListBullet"/>
+              <w:spacing w:after="24"/>
+            </w:pPr>
+            <w:r>
+              <w:t>Built data-dense enterprise interfaces with strict validation, forms, tables, and workflow requirements.</w:t>
+            </w:r>
+          </w:p>
+          <w:p>
+            <w:pPr>
+              <w:pStyle w:val="ListBullet"/>
+              <w:spacing w:after="24"/>
+            </w:pPr>
+            <w:r>
+              <w:t>Supported Scrum delivery, browser regression fixes, API/schema-linked UI defects, UAT cycles, and production RCA.</w:t>
+            </w:r>
+          </w:p>
+          <w:p>
+            <w:pPr>
+              <w:spacing w:before="80"/>
+            </w:pPr>
+            <w:r>
+              <w:rPr>
+                <w:b/>
+              </w:rPr>
+              <w:t>Frontend / Web Consultant, Capgemini, Efurtherance, E10 InfoTech, Aambit Softwares</w:t>
+            </w:r>
+            <w:r>
+              <w:t xml:space="preserve"> | 2012 - 2014</w:t>
+            </w:r>
+          </w:p>
+          <w:p>
+            <w:pPr>
+              <w:pStyle w:val="ListBullet"/>
+              <w:spacing w:after="24"/>
+            </w:pPr>
+            <w:r>
+              <w:t>Delivered frontend modules, layouts, mockups, client checkpoints, bug fixes, and integration support across early client projects.</w:t>
+            </w:r>
+          </w:p>
+        </w:tc>
+      </w:tr>
+    </w:tbl>
     <w:p>
       <w:pPr>
-        <w:jc w:val="center"/>
+        <w:sectPr>
+          <w:pgSz w:w="12240" w:h="15840"/>
+          <w:pgMar w:top="403" w:right="403" w:bottom="403" w:left="403" w:header="720" w:footer="720" w:gutter="0"/>
+          <w:cols w:space="720"/>
+          <w:docGrid w:linePitch="360"/>
+        </w:sectPr>
+      </w:pPr>
+    </w:p>
+    <w:p>
+      <w:pPr>
+        <w:spacing w:before="140" w:after="40"/>
       </w:pPr>
       <w:r>
         <w:rPr>
           <w:b/>
-          <w:color w:val="142C50"/>
-          <w:sz w:val="38"/>
+          <w:color w:val="0D5A4A"/>
+          <w:sz w:val="20"/>
         </w:rPr>
-        <w:t>Ankit Parekh</w:t>
-      </w:r>
-    </w:p>
-    <w:p>
-      <w:pPr>
-        <w:jc w:val="center"/>
-      </w:pPr>
-      <w:r>
-        <w:rPr>
-          <w:b/>
-          <w:sz w:val="21"/>
-        </w:rPr>
-        <w:t>AI Frontend Architect | Enterprise Angular Architect | Copilot and LLM App Engineer</w:t>
-      </w:r>
-    </w:p>
-    <w:p>
-      <w:pPr>
-        <w:spacing w:after="120"/>
-        <w:jc w:val="center"/>
-      </w:pPr>
-      <w:r>
-        <w:t>Mumbai, India | Immediate joiner | Open to Germany, Ireland, and remote Europe roles | ankit77parekh@gmail.com | +91 9920353532 | GitHub: github.com/AnkitParekh007 | LinkedIn: in.linkedin.com/in/akkiparekh | Portfolio: ankitparekh007.github.io/resume/</w:t>
-      </w:r>
-    </w:p>
-    <w:p>
-      <w:pPr>
-        <w:spacing w:before="160" w:after="60"/>
-      </w:pPr>
-      <w:r>
-        <w:rPr>
-          <w:b/>
-          <w:color w:val="204A78"/>
-          <w:sz w:val="21"/>
-        </w:rPr>
-        <w:t>PROFESSIONAL SUMMARY</w:t>
-      </w:r>
-    </w:p>
-    <w:p>
-      <w:r>
-        <w:t>AI Frontend Architect with 18+ years of experience building enterprise web products, large Angular and TypeScript applications, and intelligent UI systems. Focused on AI-native frontend architecture: embedded copilots, RAG-powered interfaces, multi-agent workflows, tool execution, streaming UX, and UI-aware assistants that operate inside real product workflows.</w:t>
-      </w:r>
-    </w:p>
-    <w:p>
-      <w:pPr>
-        <w:spacing w:before="160" w:after="60"/>
-      </w:pPr>
-      <w:r>
-        <w:rPr>
-          <w:b/>
-          <w:color w:val="204A78"/>
-          <w:sz w:val="21"/>
-        </w:rPr>
-        <w:t>CORE STRENGTHS</w:t>
-      </w:r>
-    </w:p>
-    <w:p>
-      <w:pPr>
-        <w:pStyle w:val="ListBullet"/>
-        <w:spacing w:after="40"/>
-      </w:pPr>
-      <w:r>
-        <w:t>Architect large Angular and TypeScript applications with clear module boundaries, reusable UI patterns, and long-term ownership.</w:t>
-      </w:r>
-    </w:p>
-    <w:p>
-      <w:pPr>
-        <w:pStyle w:val="ListBullet"/>
-        <w:spacing w:after="40"/>
-      </w:pPr>
-      <w:r>
-        <w:t>Design AI copilots that understand product context, answer from documentation and workflows, and execute actions through APIs and navigation.</w:t>
-      </w:r>
-    </w:p>
-    <w:p>
-      <w:pPr>
-        <w:pStyle w:val="ListBullet"/>
-        <w:spacing w:after="40"/>
-      </w:pPr>
-      <w:r>
-        <w:t>Translate complex enterprise workflows into usable product experiences across dense forms, tables, dashboards, and operational UI.</w:t>
-      </w:r>
-    </w:p>
-    <w:p>
-      <w:pPr>
-        <w:pStyle w:val="ListBullet"/>
-        <w:spacing w:after="40"/>
-      </w:pPr>
-      <w:r>
-        <w:t>Lead delivery across frontend, product, DevOps, and platform teams with production sustainment discipline.</w:t>
-      </w:r>
-    </w:p>
-    <w:p>
-      <w:pPr>
-        <w:spacing w:before="160" w:after="60"/>
-      </w:pPr>
-      <w:r>
-        <w:rPr>
-          <w:b/>
-          <w:color w:val="204A78"/>
-          <w:sz w:val="21"/>
-        </w:rPr>
-        <w:t>TECHNICAL SKILLS</w:t>
+        <w:t>TECHNICAL CAPABILITIES</w:t>
       </w:r>
     </w:p>
     <w:tbl>
@@ -130,6 +731,7 @@
         <w:tc>
           <w:tcPr>
             <w:tcW w:type="dxa" w:w="5328"/>
+            <w:shd w:fill="F3F8F6"/>
           </w:tcPr>
           <w:p>
             <w:r>
@@ -146,7 +748,7 @@
           </w:tcPr>
           <w:p>
             <w:r>
-              <w:t>Angular, TypeScript, RxJS, JavaScript, HTML5, CSS3, Sass, React, UI architecture</w:t>
+              <w:t>Angular, TypeScript, RxJS, JavaScript, HTML5, CSS3, Sass, React</w:t>
             </w:r>
           </w:p>
         </w:tc>
@@ -155,6 +757,7 @@
         <w:tc>
           <w:tcPr>
             <w:tcW w:type="dxa" w:w="5328"/>
+            <w:shd w:fill="F3F8F6"/>
           </w:tcPr>
           <w:p>
             <w:r>
@@ -171,7 +774,7 @@
           </w:tcPr>
           <w:p>
             <w:r>
-              <w:t>Copilots, AI agents, RAG, LLM integrations, prompt flows, tool calling, streaming UX, guardrails</w:t>
+              <w:t>Copilots, RAG, AI agents, tool calling, streaming UX, prompt flows, guardrails</w:t>
             </w:r>
           </w:p>
         </w:tc>
@@ -180,6 +783,7 @@
         <w:tc>
           <w:tcPr>
             <w:tcW w:type="dxa" w:w="5328"/>
+            <w:shd w:fill="F3F8F6"/>
           </w:tcPr>
           <w:p>
             <w:r>
@@ -196,7 +800,7 @@
           </w:tcPr>
           <w:p>
             <w:r>
-              <w:t>Enterprise frontend platforms, modular systems, component boundaries, design systems, state ownership</w:t>
+              <w:t>Enterprise UI platforms, modular systems, design systems, state ownership</w:t>
             </w:r>
           </w:p>
         </w:tc>
@@ -205,13 +809,14 @@
         <w:tc>
           <w:tcPr>
             <w:tcW w:type="dxa" w:w="5328"/>
+            <w:shd w:fill="F3F8F6"/>
           </w:tcPr>
           <w:p>
             <w:r>
               <w:rPr>
                 <w:b/>
               </w:rPr>
-              <w:t>Backend / Cloud</w:t>
+              <w:t>Cloud</w:t>
             </w:r>
           </w:p>
         </w:tc>
@@ -221,7 +826,7 @@
           </w:tcPr>
           <w:p>
             <w:r>
-              <w:t>Node.js, Express.js, Python, AWS, Docker, Kubernetes, Jenkins, CI/CD</w:t>
+              <w:t>AWS, Docker, Kubernetes, Jenkins, CI/CD</w:t>
             </w:r>
           </w:p>
         </w:tc>
@@ -230,13 +835,14 @@
         <w:tc>
           <w:tcPr>
             <w:tcW w:type="dxa" w:w="5328"/>
+            <w:shd w:fill="F3F8F6"/>
           </w:tcPr>
           <w:p>
             <w:r>
               <w:rPr>
                 <w:b/>
               </w:rPr>
-              <w:t>Product UX</w:t>
+              <w:t>Backend</w:t>
             </w:r>
           </w:p>
         </w:tc>
@@ -246,7 +852,7 @@
           </w:tcPr>
           <w:p>
             <w:r>
-              <w:t>Wireframes, interaction flows, usability-led iteration, data-heavy workflows, stakeholder alignment</w:t>
+              <w:t>Node.js, Express.js, Python</w:t>
             </w:r>
           </w:p>
         </w:tc>
@@ -254,311 +860,13 @@
     </w:tbl>
     <w:p>
       <w:pPr>
-        <w:spacing w:before="160" w:after="60"/>
+        <w:spacing w:before="140" w:after="40"/>
       </w:pPr>
       <w:r>
         <w:rPr>
           <w:b/>
-          <w:color w:val="204A78"/>
-          <w:sz w:val="21"/>
-        </w:rPr>
-        <w:t>AI FRONTEND WORK</w:t>
-      </w:r>
-    </w:p>
-    <w:p>
-      <w:pPr>
-        <w:spacing w:before="60"/>
-      </w:pPr>
-      <w:r>
-        <w:rPr>
-          <w:b/>
-        </w:rPr>
-        <w:t>Embedded copilot for enterprise apps</w:t>
-      </w:r>
-    </w:p>
-    <w:p>
-      <w:pPr>
-        <w:pStyle w:val="ListBullet"/>
-        <w:spacing w:after="40"/>
-      </w:pPr>
-      <w:r>
-        <w:t>Product-grade copilot concept for Angular and web apps that understands routes, selected records, forms, DOM context, and user intent.</w:t>
-      </w:r>
-    </w:p>
-    <w:p>
-      <w:pPr>
-        <w:pStyle w:val="ListBullet"/>
-        <w:spacing w:after="40"/>
-      </w:pPr>
-      <w:r>
-        <w:t>Supports multi-agent modes for plan, execute, debug, and ask workflows.</w:t>
-      </w:r>
-    </w:p>
-    <w:p>
-      <w:pPr>
-        <w:pStyle w:val="ListBullet"/>
-        <w:spacing w:after="40"/>
-      </w:pPr>
-      <w:r>
-        <w:t>Uses RAG across docs, codebase knowledge, APIs, and workflows to ground responses in product context.</w:t>
-      </w:r>
-    </w:p>
-    <w:p>
-      <w:pPr>
-        <w:pStyle w:val="ListBullet"/>
-        <w:spacing w:after="40"/>
-      </w:pPr>
-      <w:r>
-        <w:t>Executes actions through APIs, navigation, workflow tools, evaluation loops, retries, and recovery paths.</w:t>
-      </w:r>
-    </w:p>
-    <w:p>
-      <w:pPr>
-        <w:spacing w:before="60"/>
-      </w:pPr>
-      <w:r>
-        <w:rPr>
-          <w:b/>
-        </w:rPr>
-        <w:t>Copilot runtime and SDK direction</w:t>
-      </w:r>
-    </w:p>
-    <w:p>
-      <w:pPr>
-        <w:pStyle w:val="ListBullet"/>
-        <w:spacing w:after="40"/>
-      </w:pPr>
-      <w:r>
-        <w:t>Reusable architecture for a copilot shell, agent orchestrator, tool registry, ingestion connectors, and enterprise-safe action execution.</w:t>
-      </w:r>
-    </w:p>
-    <w:p>
-      <w:pPr>
-        <w:pStyle w:val="ListBullet"/>
-        <w:spacing w:after="40"/>
-      </w:pPr>
-      <w:r>
-        <w:t>Designed for teams that want AI-native behavior inside Angular and TypeScript products without one-off integrations.</w:t>
-      </w:r>
-    </w:p>
-    <w:p>
-      <w:pPr>
-        <w:spacing w:before="160" w:after="60"/>
-      </w:pPr>
-      <w:r>
-        <w:rPr>
-          <w:b/>
-          <w:color w:val="204A78"/>
-          <w:sz w:val="21"/>
-        </w:rPr>
-        <w:t>PROFESSIONAL EXPERIENCE</w:t>
-      </w:r>
-    </w:p>
-    <w:p>
-      <w:pPr>
-        <w:spacing w:before="100" w:after="20"/>
-      </w:pPr>
-      <w:r>
-        <w:rPr>
-          <w:b/>
-        </w:rPr>
-        <w:t>Team Lead - Codifyd</w:t>
-      </w:r>
-      <w:r>
-        <w:t xml:space="preserve"> | 2018 - Present</w:t>
-      </w:r>
-    </w:p>
-    <w:p>
-      <w:pPr>
-        <w:pStyle w:val="ListBullet"/>
-        <w:spacing w:after="40"/>
-      </w:pPr>
-      <w:r>
-        <w:t>Own technical direction for enterprise web products, including stack fit, integration contracts, frontend architecture, and delivery trade-offs.</w:t>
-      </w:r>
-    </w:p>
-    <w:p>
-      <w:pPr>
-        <w:pStyle w:val="ListBullet"/>
-        <w:spacing w:after="40"/>
-      </w:pPr>
-      <w:r>
-        <w:t>Define system boundaries for large multi-module web applications and sustain production codebases through refactors, regression control, and release coordination.</w:t>
-      </w:r>
-    </w:p>
-    <w:p>
-      <w:pPr>
-        <w:pStyle w:val="ListBullet"/>
-        <w:spacing w:after="40"/>
-      </w:pPr>
-      <w:r>
-        <w:t>Create wireframes, interaction flows, and reusable UI patterns to align product intent with engineering constraints.</w:t>
-      </w:r>
-    </w:p>
-    <w:p>
-      <w:pPr>
-        <w:pStyle w:val="ListBullet"/>
-        <w:spacing w:after="40"/>
-      </w:pPr>
-      <w:r>
-        <w:t>Partner with DevOps and platform teams on CI/CD, build tooling, environment-specific defects, and cross-stack troubleshooting.</w:t>
-      </w:r>
-    </w:p>
-    <w:p>
-      <w:pPr>
-        <w:pStyle w:val="ListBullet"/>
-        <w:spacing w:after="40"/>
-      </w:pPr>
-      <w:r>
-        <w:t>Lead UX engineering for data-heavy product platforms with forms, tables, workflows, validation, consistency, and long-running operational flows.</w:t>
-      </w:r>
-    </w:p>
-    <w:p>
-      <w:pPr>
-        <w:spacing w:before="100" w:after="20"/>
-      </w:pPr>
-      <w:r>
-        <w:rPr>
-          <w:b/>
-        </w:rPr>
-        <w:t>Front-end Expert - Zooty.in</w:t>
-      </w:r>
-      <w:r>
-        <w:t xml:space="preserve"> | 2016 - 2018</w:t>
-      </w:r>
-    </w:p>
-    <w:p>
-      <w:pPr>
-        <w:pStyle w:val="ListBullet"/>
-        <w:spacing w:after="40"/>
-      </w:pPr>
-      <w:r>
-        <w:t>Steered frontend implementation strategy, dependencies, sequencing, and UI architecture for customer-facing web products.</w:t>
-      </w:r>
-    </w:p>
-    <w:p>
-      <w:pPr>
-        <w:pStyle w:val="ListBullet"/>
-        <w:spacing w:after="40"/>
-      </w:pPr>
-      <w:r>
-        <w:t>Designed component boundaries, state ownership, interaction flows, and maintainable UI structure.</w:t>
-      </w:r>
-    </w:p>
-    <w:p>
-      <w:pPr>
-        <w:pStyle w:val="ListBullet"/>
-        <w:spacing w:after="40"/>
-      </w:pPr>
-      <w:r>
-        <w:t>Owned UX outcomes, defect triage, performance hotspots, and incremental hardening of live systems.</w:t>
-      </w:r>
-    </w:p>
-    <w:p>
-      <w:pPr>
-        <w:spacing w:before="100" w:after="20"/>
-      </w:pPr>
-      <w:r>
-        <w:rPr>
-          <w:b/>
-        </w:rPr>
-        <w:t>Lead Front-end Programmer - Musafir.com</w:t>
-      </w:r>
-      <w:r>
-        <w:t xml:space="preserve"> | 2015 - 2016</w:t>
-      </w:r>
-    </w:p>
-    <w:p>
-      <w:pPr>
-        <w:pStyle w:val="ListBullet"/>
-        <w:spacing w:after="40"/>
-      </w:pPr>
-      <w:r>
-        <w:t>Implemented and reviewed production UI for high-traffic travel workflows including search, pricing, booking, and checkout surfaces.</w:t>
-      </w:r>
-    </w:p>
-    <w:p>
-      <w:pPr>
-        <w:pStyle w:val="ListBullet"/>
-        <w:spacing w:after="40"/>
-      </w:pPr>
-      <w:r>
-        <w:t>Resolved complex rendering, layout, and performance issues under real traffic and data-load conditions.</w:t>
-      </w:r>
-    </w:p>
-    <w:p>
-      <w:pPr>
-        <w:pStyle w:val="ListBullet"/>
-        <w:spacing w:after="40"/>
-      </w:pPr>
-      <w:r>
-        <w:t>Partnered with product and clients on acceptance criteria, demos, technical feasibility, and UI-heavy feature delivery.</w:t>
-      </w:r>
-    </w:p>
-    <w:p>
-      <w:pPr>
-        <w:spacing w:before="100" w:after="20"/>
-      </w:pPr>
-      <w:r>
-        <w:rPr>
-          <w:b/>
-        </w:rPr>
-        <w:t>Senior Front-end Developer - Verdantis Pvt Ltd.</w:t>
-      </w:r>
-      <w:r>
-        <w:t xml:space="preserve"> | 2014 - 2015</w:t>
-      </w:r>
-    </w:p>
-    <w:p>
-      <w:pPr>
-        <w:pStyle w:val="ListBullet"/>
-        <w:spacing w:after="40"/>
-      </w:pPr>
-      <w:r>
-        <w:t>Built data-dense enterprise interfaces with strict validation, forms, tables, and workflow requirements.</w:t>
-      </w:r>
-    </w:p>
-    <w:p>
-      <w:pPr>
-        <w:pStyle w:val="ListBullet"/>
-        <w:spacing w:after="40"/>
-      </w:pPr>
-      <w:r>
-        <w:t>Supported Scrum delivery, browser regression fixes, API/schema-linked UI defects, UAT cycles, and production RCA.</w:t>
-      </w:r>
-    </w:p>
-    <w:p>
-      <w:pPr>
-        <w:spacing w:before="100" w:after="20"/>
-      </w:pPr>
-      <w:r>
-        <w:rPr>
-          <w:b/>
-        </w:rPr>
-        <w:t>Freelance Usability Consultant / Web Developer - Capgemini, Efurtherance, E10 InfoTech, Aambit Softwares</w:t>
-      </w:r>
-      <w:r>
-        <w:t xml:space="preserve"> | 2012 - 2014</w:t>
-      </w:r>
-    </w:p>
-    <w:p>
-      <w:pPr>
-        <w:pStyle w:val="ListBullet"/>
-        <w:spacing w:after="40"/>
-      </w:pPr>
-      <w:r>
-        <w:t>Delivered frontend modules, layouts, mockups, client checkpoints, bug fixes, and integration support across early-stage client projects.</w:t>
-      </w:r>
-    </w:p>
-    <w:p>
-      <w:pPr>
-        <w:spacing w:before="160" w:after="60"/>
-      </w:pPr>
-      <w:r>
-        <w:rPr>
-          <w:b/>
-          <w:color w:val="204A78"/>
-          <w:sz w:val="21"/>
+          <w:color w:val="0D5A4A"/>
+          <w:sz w:val="20"/>
         </w:rPr>
         <w:t>PRODUCTION DOMAINS</w:t>
       </w:r>
@@ -566,39 +874,39 @@
     <w:p>
       <w:pPr>
         <w:pStyle w:val="ListBullet"/>
-        <w:spacing w:after="40"/>
+        <w:spacing w:after="24"/>
       </w:pPr>
       <w:r>
-        <w:t>Travel technology: search, pricing, booking, checkout, high-traffic consumer flows.</w:t>
+        <w:t>Travel tech: search, pricing, booking, checkout, high-traffic consumer flows.</w:t>
       </w:r>
     </w:p>
     <w:p>
       <w:pPr>
         <w:pStyle w:val="ListBullet"/>
-        <w:spacing w:after="40"/>
+        <w:spacing w:after="24"/>
       </w:pPr>
       <w:r>
-        <w:t>Product data platforms: catalogs, governance workflows, data-heavy forms, bulk actions, and analyst operations.</w:t>
+        <w:t>Product data platforms: catalogs, governance workflows, bulk actions, and analyst operations.</w:t>
       </w:r>
     </w:p>
     <w:p>
       <w:pPr>
         <w:pStyle w:val="ListBullet"/>
-        <w:spacing w:after="40"/>
+        <w:spacing w:after="24"/>
       </w:pPr>
       <w:r>
-        <w:t>Logistics and operations systems: dashboards, shipment visibility, exceptions, role-based workflows, and customer surfaces.</w:t>
+        <w:t>Logistics systems: dashboards, shipment visibility, exceptions, and role-based workflows.</w:t>
       </w:r>
     </w:p>
     <w:p>
       <w:pPr>
-        <w:spacing w:before="160" w:after="60"/>
+        <w:spacing w:before="140" w:after="40"/>
       </w:pPr>
       <w:r>
         <w:rPr>
           <w:b/>
-          <w:color w:val="204A78"/>
-          <w:sz w:val="21"/>
+          <w:color w:val="0D5A4A"/>
+          <w:sz w:val="20"/>
         </w:rPr>
         <w:t>EDUCATION</w:t>
       </w:r>
@@ -606,7 +914,7 @@
     <w:p>
       <w:pPr>
         <w:pStyle w:val="ListBullet"/>
-        <w:spacing w:after="40"/>
+        <w:spacing w:after="24"/>
       </w:pPr>
       <w:r>
         <w:t>Bachelor of Engineering in Computer Science - Atharva College of Engineering, Mumbai</w:t>
@@ -615,7 +923,7 @@
     <w:p>
       <w:pPr>
         <w:pStyle w:val="ListBullet"/>
-        <w:spacing w:after="40"/>
+        <w:spacing w:after="24"/>
       </w:pPr>
       <w:r>
         <w:t>Higher Secondary Education - Royal College of Arts &amp; Science, Mumbai</w:t>
@@ -623,13 +931,13 @@
     </w:p>
     <w:p>
       <w:pPr>
-        <w:spacing w:before="160" w:after="60"/>
+        <w:spacing w:before="140" w:after="40"/>
       </w:pPr>
       <w:r>
         <w:rPr>
           <w:b/>
-          <w:color w:val="204A78"/>
-          <w:sz w:val="21"/>
+          <w:color w:val="0D5A4A"/>
+          <w:sz w:val="20"/>
         </w:rPr>
         <w:t>PUBLIC PROOF</w:t>
       </w:r>
@@ -637,19 +945,28 @@
     <w:p>
       <w:pPr>
         <w:pStyle w:val="ListBullet"/>
-        <w:spacing w:after="40"/>
+        <w:spacing w:after="24"/>
       </w:pPr>
       <w:r>
-        <w:t>GitHub profile aligned to AI Frontend Architect positioning: github.com/AnkitParekh007</w:t>
+        <w:t>GitHub: github.com/AnkitParekh007</w:t>
       </w:r>
     </w:p>
     <w:p>
       <w:pPr>
         <w:pStyle w:val="ListBullet"/>
-        <w:spacing w:after="40"/>
+        <w:spacing w:after="24"/>
       </w:pPr>
       <w:r>
-        <w:t>Current public direction: angular-ai-copilot-starter, ngx-copilot-sdk, ai-ui-agent-demo, frontend-ai-patterns.</w:t>
+        <w:t>Portfolio: ankitparekh007.github.io/resume/</w:t>
+      </w:r>
+    </w:p>
+    <w:p>
+      <w:pPr>
+        <w:pStyle w:val="ListBullet"/>
+        <w:spacing w:after="24"/>
+      </w:pPr>
+      <w:r>
+        <w:t>Current direction: angular-ai-copilot-starter, ngx-copilot-sdk, ai-ui-agent-demo, frontend-ai-patterns.</w:t>
       </w:r>
     </w:p>
     <w:sectPr>
@@ -1027,7 +1344,7 @@
     <w:rsid w:val="00FC693F"/>
     <w:rPr>
       <w:rFonts w:ascii="Aptos" w:hAnsi="Aptos"/>
-      <w:sz w:val="18"/>
+      <w:sz w:val="17"/>
     </w:rPr>
   </w:style>
   <w:style w:type="paragraph" w:styleId="Header">

</xml_diff>

<commit_message>
Apply AI color palette to resume
</commit_message>
<xml_diff>
--- a/AnkitParekh_Resume.docx
+++ b/AnkitParekh_Resume.docx
@@ -17,7 +17,7 @@
           <w:tcPr>
             <w:tcW w:type="dxa" w:w="2952"/>
             <w:vAlign w:val="top"/>
-            <w:shd w:fill="0D5A4A"/>
+            <w:shd w:fill="111827"/>
           </w:tcPr>
           <w:p>
             <w:pPr>
@@ -39,7 +39,7 @@
             <w:r>
               <w:rPr>
                 <w:b/>
-                <w:color w:val="DCEFE9"/>
+                <w:color w:val="DCEBFF"/>
                 <w:sz w:val="18"/>
               </w:rPr>
               <w:t>AI Frontend Architect</w:t>
@@ -51,7 +51,7 @@
             </w:pPr>
             <w:r>
               <w:rPr>
-                <w:color w:val="E8F5F1"/>
+                <w:color w:val="EAF6FF"/>
                 <w:sz w:val="15"/>
               </w:rPr>
               <w:t>Enterprise Angular | Copilots | UI Agents | LLM Apps</w:t>
@@ -73,7 +73,7 @@
           <w:p>
             <w:r>
               <w:rPr>
-                <w:color w:val="E8F5F1"/>
+                <w:color w:val="EAF6FF"/>
                 <w:sz w:val="15"/>
               </w:rPr>
               <w:t>Mumbai, India</w:t>
@@ -82,7 +82,7 @@
           <w:p>
             <w:r>
               <w:rPr>
-                <w:color w:val="E8F5F1"/>
+                <w:color w:val="EAF6FF"/>
                 <w:sz w:val="15"/>
               </w:rPr>
               <w:t>Immediate joiner</w:t>
@@ -91,7 +91,7 @@
           <w:p>
             <w:r>
               <w:rPr>
-                <w:color w:val="E8F5F1"/>
+                <w:color w:val="EAF6FF"/>
                 <w:sz w:val="15"/>
               </w:rPr>
               <w:t>Open to Germany, Ireland, and remote Europe roles</w:t>
@@ -100,7 +100,7 @@
           <w:p>
             <w:r>
               <w:rPr>
-                <w:color w:val="E8F5F1"/>
+                <w:color w:val="EAF6FF"/>
                 <w:sz w:val="15"/>
               </w:rPr>
               <w:t>ankit77parekh@gmail.com</w:t>
@@ -109,7 +109,7 @@
           <w:p>
             <w:r>
               <w:rPr>
-                <w:color w:val="E8F5F1"/>
+                <w:color w:val="EAF6FF"/>
                 <w:sz w:val="15"/>
               </w:rPr>
               <w:t>+91 9920353532</w:t>
@@ -186,7 +186,7 @@
           <w:p>
             <w:r>
               <w:rPr>
-                <w:color w:val="E8F5F1"/>
+                <w:color w:val="38BDF8"/>
                 <w:sz w:val="12"/>
               </w:rPr>
               <w:t>■■■■■■■■■□</w:t>
@@ -204,7 +204,7 @@
           <w:p>
             <w:r>
               <w:rPr>
-                <w:color w:val="E8F5F1"/>
+                <w:color w:val="38BDF8"/>
                 <w:sz w:val="12"/>
               </w:rPr>
               <w:t>■■■■■■■■■□</w:t>
@@ -222,7 +222,7 @@
           <w:p>
             <w:r>
               <w:rPr>
-                <w:color w:val="E8F5F1"/>
+                <w:color w:val="38BDF8"/>
                 <w:sz w:val="12"/>
               </w:rPr>
               <w:t>■■■■■■■■■□</w:t>
@@ -240,7 +240,7 @@
           <w:p>
             <w:r>
               <w:rPr>
-                <w:color w:val="E8F5F1"/>
+                <w:color w:val="38BDF8"/>
                 <w:sz w:val="12"/>
               </w:rPr>
               <w:t>■■■■■■■■□□</w:t>
@@ -258,7 +258,7 @@
           <w:p>
             <w:r>
               <w:rPr>
-                <w:color w:val="E8F5F1"/>
+                <w:color w:val="38BDF8"/>
                 <w:sz w:val="12"/>
               </w:rPr>
               <w:t>■■■■■■■■□□</w:t>
@@ -276,7 +276,7 @@
           <w:p>
             <w:r>
               <w:rPr>
-                <w:color w:val="E8F5F1"/>
+                <w:color w:val="38BDF8"/>
                 <w:sz w:val="12"/>
               </w:rPr>
               <w:t>■■■■■■■□□□</w:t>
@@ -298,7 +298,7 @@
           <w:p>
             <w:r>
               <w:rPr>
-                <w:color w:val="E8F5F1"/>
+                <w:color w:val="EAF6FF"/>
                 <w:sz w:val="15"/>
               </w:rPr>
               <w:t>AI Frontend Engineer</w:t>
@@ -307,7 +307,7 @@
           <w:p>
             <w:r>
               <w:rPr>
-                <w:color w:val="E8F5F1"/>
+                <w:color w:val="EAF6FF"/>
                 <w:sz w:val="15"/>
               </w:rPr>
               <w:t>Frontend Architect</w:t>
@@ -316,7 +316,7 @@
           <w:p>
             <w:r>
               <w:rPr>
-                <w:color w:val="E8F5F1"/>
+                <w:color w:val="EAF6FF"/>
                 <w:sz w:val="15"/>
               </w:rPr>
               <w:t>Angular Architect</w:t>
@@ -325,7 +325,7 @@
           <w:p>
             <w:r>
               <w:rPr>
-                <w:color w:val="E8F5F1"/>
+                <w:color w:val="EAF6FF"/>
                 <w:sz w:val="15"/>
               </w:rPr>
               <w:t>Copilot / LLM App Engineer</w:t>
@@ -364,7 +364,7 @@
             <w:r>
               <w:rPr>
                 <w:b/>
-                <w:color w:val="0D5A4A"/>
+                <w:color w:val="4F46E5"/>
                 <w:sz w:val="20"/>
               </w:rPr>
               <w:t>PROFILE</w:t>
@@ -418,7 +418,7 @@
             <w:r>
               <w:rPr>
                 <w:b/>
-                <w:color w:val="0D5A4A"/>
+                <w:color w:val="4F46E5"/>
                 <w:sz w:val="20"/>
               </w:rPr>
               <w:t>AI FRONTEND WORK</w:t>
@@ -507,7 +507,7 @@
             <w:r>
               <w:rPr>
                 <w:b/>
-                <w:color w:val="0D5A4A"/>
+                <w:color w:val="4F46E5"/>
                 <w:sz w:val="20"/>
               </w:rPr>
               <w:t>EMPLOYMENT HISTORY</w:t>
@@ -711,7 +711,7 @@
       <w:r>
         <w:rPr>
           <w:b/>
-          <w:color w:val="0D5A4A"/>
+          <w:color w:val="4F46E5"/>
           <w:sz w:val="20"/>
         </w:rPr>
         <w:t>TECHNICAL CAPABILITIES</w:t>
@@ -731,7 +731,7 @@
         <w:tc>
           <w:tcPr>
             <w:tcW w:type="dxa" w:w="5328"/>
-            <w:shd w:fill="F3F8F6"/>
+            <w:shd w:fill="EAF6FF"/>
           </w:tcPr>
           <w:p>
             <w:r>
@@ -757,7 +757,7 @@
         <w:tc>
           <w:tcPr>
             <w:tcW w:type="dxa" w:w="5328"/>
-            <w:shd w:fill="F3F8F6"/>
+            <w:shd w:fill="EAF6FF"/>
           </w:tcPr>
           <w:p>
             <w:r>
@@ -783,7 +783,7 @@
         <w:tc>
           <w:tcPr>
             <w:tcW w:type="dxa" w:w="5328"/>
-            <w:shd w:fill="F3F8F6"/>
+            <w:shd w:fill="EAF6FF"/>
           </w:tcPr>
           <w:p>
             <w:r>
@@ -809,7 +809,7 @@
         <w:tc>
           <w:tcPr>
             <w:tcW w:type="dxa" w:w="5328"/>
-            <w:shd w:fill="F3F8F6"/>
+            <w:shd w:fill="EAF6FF"/>
           </w:tcPr>
           <w:p>
             <w:r>
@@ -835,7 +835,7 @@
         <w:tc>
           <w:tcPr>
             <w:tcW w:type="dxa" w:w="5328"/>
-            <w:shd w:fill="F3F8F6"/>
+            <w:shd w:fill="EAF6FF"/>
           </w:tcPr>
           <w:p>
             <w:r>
@@ -865,7 +865,7 @@
       <w:r>
         <w:rPr>
           <w:b/>
-          <w:color w:val="0D5A4A"/>
+          <w:color w:val="4F46E5"/>
           <w:sz w:val="20"/>
         </w:rPr>
         <w:t>PRODUCTION DOMAINS</w:t>
@@ -905,7 +905,7 @@
       <w:r>
         <w:rPr>
           <w:b/>
-          <w:color w:val="0D5A4A"/>
+          <w:color w:val="4F46E5"/>
           <w:sz w:val="20"/>
         </w:rPr>
         <w:t>EDUCATION</w:t>
@@ -936,7 +936,7 @@
       <w:r>
         <w:rPr>
           <w:b/>
-          <w:color w:val="0D5A4A"/>
+          <w:color w:val="4F46E5"/>
           <w:sz w:val="20"/>
         </w:rPr>
         <w:t>PUBLIC PROOF</w:t>

</xml_diff>

<commit_message>
Match resume background to AI portfolio theme
</commit_message>
<xml_diff>
--- a/AnkitParekh_Resume.docx
+++ b/AnkitParekh_Resume.docx
@@ -17,7 +17,7 @@
           <w:tcPr>
             <w:tcW w:type="dxa" w:w="2952"/>
             <w:vAlign w:val="top"/>
-            <w:shd w:fill="111827"/>
+            <w:shd w:fill="07080D"/>
           </w:tcPr>
           <w:p>
             <w:pPr>
@@ -39,7 +39,7 @@
             <w:r>
               <w:rPr>
                 <w:b/>
-                <w:color w:val="DCEBFF"/>
+                <w:color w:val="C5D4FF"/>
                 <w:sz w:val="18"/>
               </w:rPr>
               <w:t>AI Frontend Architect</w:t>
@@ -51,7 +51,7 @@
             </w:pPr>
             <w:r>
               <w:rPr>
-                <w:color w:val="EAF6FF"/>
+                <w:color w:val="E8EAF0"/>
                 <w:sz w:val="15"/>
               </w:rPr>
               <w:t>Enterprise Angular | Copilots | UI Agents | LLM Apps</w:t>
@@ -73,7 +73,7 @@
           <w:p>
             <w:r>
               <w:rPr>
-                <w:color w:val="EAF6FF"/>
+                <w:color w:val="E8EAF0"/>
                 <w:sz w:val="15"/>
               </w:rPr>
               <w:t>Mumbai, India</w:t>
@@ -82,7 +82,7 @@
           <w:p>
             <w:r>
               <w:rPr>
-                <w:color w:val="EAF6FF"/>
+                <w:color w:val="E8EAF0"/>
                 <w:sz w:val="15"/>
               </w:rPr>
               <w:t>Immediate joiner</w:t>
@@ -91,7 +91,7 @@
           <w:p>
             <w:r>
               <w:rPr>
-                <w:color w:val="EAF6FF"/>
+                <w:color w:val="E8EAF0"/>
                 <w:sz w:val="15"/>
               </w:rPr>
               <w:t>Open to Germany, Ireland, and remote Europe roles</w:t>
@@ -100,7 +100,7 @@
           <w:p>
             <w:r>
               <w:rPr>
-                <w:color w:val="EAF6FF"/>
+                <w:color w:val="E8EAF0"/>
                 <w:sz w:val="15"/>
               </w:rPr>
               <w:t>ankit77parekh@gmail.com</w:t>
@@ -109,7 +109,7 @@
           <w:p>
             <w:r>
               <w:rPr>
-                <w:color w:val="EAF6FF"/>
+                <w:color w:val="E8EAF0"/>
                 <w:sz w:val="15"/>
               </w:rPr>
               <w:t>+91 9920353532</w:t>
@@ -298,7 +298,7 @@
           <w:p>
             <w:r>
               <w:rPr>
-                <w:color w:val="EAF6FF"/>
+                <w:color w:val="E8EAF0"/>
                 <w:sz w:val="15"/>
               </w:rPr>
               <w:t>AI Frontend Engineer</w:t>
@@ -307,7 +307,7 @@
           <w:p>
             <w:r>
               <w:rPr>
-                <w:color w:val="EAF6FF"/>
+                <w:color w:val="E8EAF0"/>
                 <w:sz w:val="15"/>
               </w:rPr>
               <w:t>Frontend Architect</w:t>
@@ -316,7 +316,7 @@
           <w:p>
             <w:r>
               <w:rPr>
-                <w:color w:val="EAF6FF"/>
+                <w:color w:val="E8EAF0"/>
                 <w:sz w:val="15"/>
               </w:rPr>
               <w:t>Angular Architect</w:t>
@@ -325,7 +325,7 @@
           <w:p>
             <w:r>
               <w:rPr>
-                <w:color w:val="EAF6FF"/>
+                <w:color w:val="E8EAF0"/>
                 <w:sz w:val="15"/>
               </w:rPr>
               <w:t>Copilot / LLM App Engineer</w:t>
@@ -336,12 +336,13 @@
           <w:tcPr>
             <w:tcW w:type="dxa" w:w="7344"/>
             <w:vAlign w:val="top"/>
+            <w:shd w:fill="121623"/>
           </w:tcPr>
           <w:p>
             <w:r>
               <w:rPr>
                 <w:b/>
-                <w:color w:val="171717"/>
+                <w:color w:val="F8FAFC"/>
                 <w:sz w:val="44"/>
               </w:rPr>
               <w:t>Ankit Parekh</w:t>
@@ -351,7 +352,7 @@
             <w:r>
               <w:rPr>
                 <w:b/>
-                <w:color w:val="60656F"/>
+                <w:color w:val="C5D4FF"/>
                 <w:sz w:val="19"/>
               </w:rPr>
               <w:t>AI Frontend Architect - Enterprise Angular | Copilots | UI Agents | LLM Apps</w:t>
@@ -364,7 +365,7 @@
             <w:r>
               <w:rPr>
                 <w:b/>
-                <w:color w:val="4F46E5"/>
+                <w:color w:val="5B8CFF"/>
                 <w:sz w:val="20"/>
               </w:rPr>
               <w:t>PROFILE</w:t>
@@ -372,6 +373,9 @@
           </w:p>
           <w:p>
             <w:r>
+              <w:rPr>
+                <w:color w:val="E8EAF0"/>
+              </w:rPr>
               <w:t>AI Frontend Architect with 18+ years of experience shipping enterprise web products, large Angular and TypeScript applications, and intelligent UI systems. I build AI-native frontend experiences where copilots, RAG, tool execution, and agentic workflows live inside real applications, not beside them.</w:t>
             </w:r>
           </w:p>
@@ -381,6 +385,9 @@
               <w:spacing w:after="24"/>
             </w:pPr>
             <w:r>
+              <w:rPr>
+                <w:color w:val="E8EAF0"/>
+              </w:rPr>
               <w:t>Architect large Angular platforms with clear module boundaries, reusable UI patterns, and long-term ownership.</w:t>
             </w:r>
           </w:p>
@@ -390,6 +397,9 @@
               <w:spacing w:after="24"/>
             </w:pPr>
             <w:r>
+              <w:rPr>
+                <w:color w:val="E8EAF0"/>
+              </w:rPr>
               <w:t>Design embedded copilots that understand product context, retrieve grounded answers, and execute workflow actions.</w:t>
             </w:r>
           </w:p>
@@ -399,6 +409,9 @@
               <w:spacing w:after="24"/>
             </w:pPr>
             <w:r>
+              <w:rPr>
+                <w:color w:val="E8EAF0"/>
+              </w:rPr>
               <w:t>Turn complex enterprise workflows into usable interfaces across dense forms, tables, dashboards, and operational UI.</w:t>
             </w:r>
           </w:p>
@@ -408,6 +421,9 @@
               <w:spacing w:after="24"/>
             </w:pPr>
             <w:r>
+              <w:rPr>
+                <w:color w:val="E8EAF0"/>
+              </w:rPr>
               <w:t>Lead delivery across product, frontend, DevOps, and platform teams with production sustainment discipline.</w:t>
             </w:r>
           </w:p>
@@ -418,7 +434,7 @@
             <w:r>
               <w:rPr>
                 <w:b/>
-                <w:color w:val="4F46E5"/>
+                <w:color w:val="5B8CFF"/>
                 <w:sz w:val="20"/>
               </w:rPr>
               <w:t>AI FRONTEND WORK</w:t>
@@ -431,6 +447,7 @@
             <w:r>
               <w:rPr>
                 <w:b/>
+                <w:color w:val="E8EAF0"/>
               </w:rPr>
               <w:t>Embedded Copilot for Enterprise Apps</w:t>
             </w:r>
@@ -441,6 +458,9 @@
               <w:spacing w:after="24"/>
             </w:pPr>
             <w:r>
+              <w:rPr>
+                <w:color w:val="E8EAF0"/>
+              </w:rPr>
               <w:t>Copilot concept for Angular and web apps that understands routes, selected records, forms, DOM context, and user intent.</w:t>
             </w:r>
           </w:p>
@@ -450,6 +470,9 @@
               <w:spacing w:after="24"/>
             </w:pPr>
             <w:r>
+              <w:rPr>
+                <w:color w:val="E8EAF0"/>
+              </w:rPr>
               <w:t>Multi-agent modes for plan, execute, debug, and ask workflows.</w:t>
             </w:r>
           </w:p>
@@ -459,6 +482,9 @@
               <w:spacing w:after="24"/>
             </w:pPr>
             <w:r>
+              <w:rPr>
+                <w:color w:val="E8EAF0"/>
+              </w:rPr>
               <w:t>RAG across docs, codebase knowledge, APIs, and workflows to ground responses in product context.</w:t>
             </w:r>
           </w:p>
@@ -468,6 +494,9 @@
               <w:spacing w:after="24"/>
             </w:pPr>
             <w:r>
+              <w:rPr>
+                <w:color w:val="E8EAF0"/>
+              </w:rPr>
               <w:t>Action execution through APIs, navigation, workflow tools, evaluation loops, retries, and recovery paths.</w:t>
             </w:r>
           </w:p>
@@ -478,6 +507,7 @@
             <w:r>
               <w:rPr>
                 <w:b/>
+                <w:color w:val="E8EAF0"/>
               </w:rPr>
               <w:t>Copilot Runtime and SDK Direction</w:t>
             </w:r>
@@ -488,6 +518,9 @@
               <w:spacing w:after="24"/>
             </w:pPr>
             <w:r>
+              <w:rPr>
+                <w:color w:val="E8EAF0"/>
+              </w:rPr>
               <w:t>Reusable architecture for a copilot shell, agent orchestrator, tool registry, ingestion connectors, and enterprise-safe action execution.</w:t>
             </w:r>
           </w:p>
@@ -497,6 +530,9 @@
               <w:spacing w:after="24"/>
             </w:pPr>
             <w:r>
+              <w:rPr>
+                <w:color w:val="E8EAF0"/>
+              </w:rPr>
               <w:t>Designed for teams that want AI-native behavior inside Angular and TypeScript products without one-off integrations.</w:t>
             </w:r>
           </w:p>
@@ -507,7 +543,7 @@
             <w:r>
               <w:rPr>
                 <w:b/>
-                <w:color w:val="4F46E5"/>
+                <w:color w:val="5B8CFF"/>
                 <w:sz w:val="20"/>
               </w:rPr>
               <w:t>EMPLOYMENT HISTORY</w:t>
@@ -520,10 +556,14 @@
             <w:r>
               <w:rPr>
                 <w:b/>
+                <w:color w:val="E8EAF0"/>
               </w:rPr>
               <w:t>Team Lead, Codifyd</w:t>
             </w:r>
             <w:r>
+              <w:rPr>
+                <w:color w:val="E8EAF0"/>
+              </w:rPr>
               <w:t xml:space="preserve"> | 2018 - Present</w:t>
             </w:r>
           </w:p>
@@ -533,6 +573,9 @@
               <w:spacing w:after="24"/>
             </w:pPr>
             <w:r>
+              <w:rPr>
+                <w:color w:val="E8EAF0"/>
+              </w:rPr>
               <w:t>Own technical direction for enterprise web products, including stack fit, integration contracts, frontend architecture, and delivery trade-offs.</w:t>
             </w:r>
           </w:p>
@@ -542,6 +585,9 @@
               <w:spacing w:after="24"/>
             </w:pPr>
             <w:r>
+              <w:rPr>
+                <w:color w:val="E8EAF0"/>
+              </w:rPr>
               <w:t>Define system boundaries for large multi-module web applications and sustain production codebases through refactors, regression control, and release coordination.</w:t>
             </w:r>
           </w:p>
@@ -551,6 +597,9 @@
               <w:spacing w:after="24"/>
             </w:pPr>
             <w:r>
+              <w:rPr>
+                <w:color w:val="E8EAF0"/>
+              </w:rPr>
               <w:t>Create wireframes, interaction flows, and reusable UI patterns to align product intent with engineering constraints.</w:t>
             </w:r>
           </w:p>
@@ -560,6 +609,9 @@
               <w:spacing w:after="24"/>
             </w:pPr>
             <w:r>
+              <w:rPr>
+                <w:color w:val="E8EAF0"/>
+              </w:rPr>
               <w:t>Partner with DevOps and platform teams on CI/CD, build tooling, environment-specific defects, and cross-stack troubleshooting.</w:t>
             </w:r>
           </w:p>
@@ -570,10 +622,14 @@
             <w:r>
               <w:rPr>
                 <w:b/>
+                <w:color w:val="E8EAF0"/>
               </w:rPr>
               <w:t>Front-end Expert, Zooty.in</w:t>
             </w:r>
             <w:r>
+              <w:rPr>
+                <w:color w:val="E8EAF0"/>
+              </w:rPr>
               <w:t xml:space="preserve"> | 2016 - 2018</w:t>
             </w:r>
           </w:p>
@@ -583,6 +639,9 @@
               <w:spacing w:after="24"/>
             </w:pPr>
             <w:r>
+              <w:rPr>
+                <w:color w:val="E8EAF0"/>
+              </w:rPr>
               <w:t>Steered frontend implementation strategy, dependencies, sequencing, and UI architecture for customer-facing web products.</w:t>
             </w:r>
           </w:p>
@@ -592,6 +651,9 @@
               <w:spacing w:after="24"/>
             </w:pPr>
             <w:r>
+              <w:rPr>
+                <w:color w:val="E8EAF0"/>
+              </w:rPr>
               <w:t>Designed component boundaries, state ownership, interaction flows, and maintainable UI structure.</w:t>
             </w:r>
           </w:p>
@@ -601,6 +663,9 @@
               <w:spacing w:after="24"/>
             </w:pPr>
             <w:r>
+              <w:rPr>
+                <w:color w:val="E8EAF0"/>
+              </w:rPr>
               <w:t>Owned UX outcomes, defect triage, performance hotspots, and incremental hardening of live systems.</w:t>
             </w:r>
           </w:p>
@@ -611,10 +676,14 @@
             <w:r>
               <w:rPr>
                 <w:b/>
+                <w:color w:val="E8EAF0"/>
               </w:rPr>
               <w:t>Lead Front-end Programmer, Musafir.com</w:t>
             </w:r>
             <w:r>
+              <w:rPr>
+                <w:color w:val="E8EAF0"/>
+              </w:rPr>
               <w:t xml:space="preserve"> | 2015 - 2016</w:t>
             </w:r>
           </w:p>
@@ -624,6 +693,9 @@
               <w:spacing w:after="24"/>
             </w:pPr>
             <w:r>
+              <w:rPr>
+                <w:color w:val="E8EAF0"/>
+              </w:rPr>
               <w:t>Implemented and reviewed production UI for high-traffic travel workflows including search, pricing, booking, and checkout surfaces.</w:t>
             </w:r>
           </w:p>
@@ -633,6 +705,9 @@
               <w:spacing w:after="24"/>
             </w:pPr>
             <w:r>
+              <w:rPr>
+                <w:color w:val="E8EAF0"/>
+              </w:rPr>
               <w:t>Resolved complex rendering, layout, and performance issues under real traffic and data-load conditions.</w:t>
             </w:r>
           </w:p>
@@ -643,10 +718,14 @@
             <w:r>
               <w:rPr>
                 <w:b/>
+                <w:color w:val="E8EAF0"/>
               </w:rPr>
               <w:t>Senior Front-end Developer, Verdantis Pvt Ltd.</w:t>
             </w:r>
             <w:r>
+              <w:rPr>
+                <w:color w:val="E8EAF0"/>
+              </w:rPr>
               <w:t xml:space="preserve"> | 2014 - 2015</w:t>
             </w:r>
           </w:p>
@@ -656,6 +735,9 @@
               <w:spacing w:after="24"/>
             </w:pPr>
             <w:r>
+              <w:rPr>
+                <w:color w:val="E8EAF0"/>
+              </w:rPr>
               <w:t>Built data-dense enterprise interfaces with strict validation, forms, tables, and workflow requirements.</w:t>
             </w:r>
           </w:p>
@@ -665,6 +747,9 @@
               <w:spacing w:after="24"/>
             </w:pPr>
             <w:r>
+              <w:rPr>
+                <w:color w:val="E8EAF0"/>
+              </w:rPr>
               <w:t>Supported Scrum delivery, browser regression fixes, API/schema-linked UI defects, UAT cycles, and production RCA.</w:t>
             </w:r>
           </w:p>
@@ -675,10 +760,14 @@
             <w:r>
               <w:rPr>
                 <w:b/>
+                <w:color w:val="E8EAF0"/>
               </w:rPr>
               <w:t>Frontend / Web Consultant, Capgemini, Efurtherance, E10 InfoTech, Aambit Softwares</w:t>
             </w:r>
             <w:r>
+              <w:rPr>
+                <w:color w:val="E8EAF0"/>
+              </w:rPr>
               <w:t xml:space="preserve"> | 2012 - 2014</w:t>
             </w:r>
           </w:p>
@@ -688,6 +777,9 @@
               <w:spacing w:after="24"/>
             </w:pPr>
             <w:r>
+              <w:rPr>
+                <w:color w:val="E8EAF0"/>
+              </w:rPr>
               <w:t>Delivered frontend modules, layouts, mockups, client checkpoints, bug fixes, and integration support across early client projects.</w:t>
             </w:r>
           </w:p>
@@ -711,7 +803,7 @@
       <w:r>
         <w:rPr>
           <w:b/>
-          <w:color w:val="4F46E5"/>
+          <w:color w:val="5B8CFF"/>
           <w:sz w:val="20"/>
         </w:rPr>
         <w:t>TECHNICAL CAPABILITIES</w:t>
@@ -731,7 +823,7 @@
         <w:tc>
           <w:tcPr>
             <w:tcW w:type="dxa" w:w="5328"/>
-            <w:shd w:fill="EAF6FF"/>
+            <w:shd w:fill="1B2236"/>
           </w:tcPr>
           <w:p>
             <w:r>
@@ -757,7 +849,7 @@
         <w:tc>
           <w:tcPr>
             <w:tcW w:type="dxa" w:w="5328"/>
-            <w:shd w:fill="EAF6FF"/>
+            <w:shd w:fill="1B2236"/>
           </w:tcPr>
           <w:p>
             <w:r>
@@ -783,7 +875,7 @@
         <w:tc>
           <w:tcPr>
             <w:tcW w:type="dxa" w:w="5328"/>
-            <w:shd w:fill="EAF6FF"/>
+            <w:shd w:fill="1B2236"/>
           </w:tcPr>
           <w:p>
             <w:r>
@@ -809,7 +901,7 @@
         <w:tc>
           <w:tcPr>
             <w:tcW w:type="dxa" w:w="5328"/>
-            <w:shd w:fill="EAF6FF"/>
+            <w:shd w:fill="1B2236"/>
           </w:tcPr>
           <w:p>
             <w:r>
@@ -835,7 +927,7 @@
         <w:tc>
           <w:tcPr>
             <w:tcW w:type="dxa" w:w="5328"/>
-            <w:shd w:fill="EAF6FF"/>
+            <w:shd w:fill="1B2236"/>
           </w:tcPr>
           <w:p>
             <w:r>
@@ -865,7 +957,7 @@
       <w:r>
         <w:rPr>
           <w:b/>
-          <w:color w:val="4F46E5"/>
+          <w:color w:val="5B8CFF"/>
           <w:sz w:val="20"/>
         </w:rPr>
         <w:t>PRODUCTION DOMAINS</w:t>
@@ -905,7 +997,7 @@
       <w:r>
         <w:rPr>
           <w:b/>
-          <w:color w:val="4F46E5"/>
+          <w:color w:val="5B8CFF"/>
           <w:sz w:val="20"/>
         </w:rPr>
         <w:t>EDUCATION</w:t>
@@ -936,7 +1028,7 @@
       <w:r>
         <w:rPr>
           <w:b/>
-          <w:color w:val="4F46E5"/>
+          <w:color w:val="5B8CFF"/>
           <w:sz w:val="20"/>
         </w:rPr>
         <w:t>PUBLIC PROOF</w:t>

</xml_diff>

<commit_message>
Use light AI portfolio colors for resume
</commit_message>
<xml_diff>
--- a/AnkitParekh_Resume.docx
+++ b/AnkitParekh_Resume.docx
@@ -17,7 +17,7 @@
           <w:tcPr>
             <w:tcW w:type="dxa" w:w="2952"/>
             <w:vAlign w:val="top"/>
-            <w:shd w:fill="07080D"/>
+            <w:shd w:fill="F8FAFF"/>
           </w:tcPr>
           <w:p>
             <w:pPr>
@@ -26,7 +26,7 @@
             <w:r>
               <w:rPr>
                 <w:b/>
-                <w:color w:val="FFFFFF"/>
+                <w:color w:val="0F172A"/>
                 <w:sz w:val="38"/>
               </w:rPr>
               <w:t>Ankit Parekh</w:t>
@@ -39,7 +39,7 @@
             <w:r>
               <w:rPr>
                 <w:b/>
-                <w:color w:val="C5D4FF"/>
+                <w:color w:val="4F46E5"/>
                 <w:sz w:val="18"/>
               </w:rPr>
               <w:t>AI Frontend Architect</w:t>
@@ -51,7 +51,7 @@
             </w:pPr>
             <w:r>
               <w:rPr>
-                <w:color w:val="E8EAF0"/>
+                <w:color w:val="475569"/>
                 <w:sz w:val="15"/>
               </w:rPr>
               <w:t>Enterprise Angular | Copilots | UI Agents | LLM Apps</w:t>
@@ -64,7 +64,7 @@
             <w:r>
               <w:rPr>
                 <w:b/>
-                <w:color w:val="FFFFFF"/>
+                <w:color w:val="4F46E5"/>
                 <w:sz w:val="19"/>
               </w:rPr>
               <w:t>DETAILS</w:t>
@@ -73,7 +73,7 @@
           <w:p>
             <w:r>
               <w:rPr>
-                <w:color w:val="E8EAF0"/>
+                <w:color w:val="475569"/>
                 <w:sz w:val="15"/>
               </w:rPr>
               <w:t>Mumbai, India</w:t>
@@ -82,7 +82,7 @@
           <w:p>
             <w:r>
               <w:rPr>
-                <w:color w:val="E8EAF0"/>
+                <w:color w:val="475569"/>
                 <w:sz w:val="15"/>
               </w:rPr>
               <w:t>Immediate joiner</w:t>
@@ -91,7 +91,7 @@
           <w:p>
             <w:r>
               <w:rPr>
-                <w:color w:val="E8EAF0"/>
+                <w:color w:val="475569"/>
                 <w:sz w:val="15"/>
               </w:rPr>
               <w:t>Open to Germany, Ireland, and remote Europe roles</w:t>
@@ -100,7 +100,7 @@
           <w:p>
             <w:r>
               <w:rPr>
-                <w:color w:val="E8EAF0"/>
+                <w:color w:val="475569"/>
                 <w:sz w:val="15"/>
               </w:rPr>
               <w:t>ankit77parekh@gmail.com</w:t>
@@ -109,7 +109,7 @@
           <w:p>
             <w:r>
               <w:rPr>
-                <w:color w:val="E8EAF0"/>
+                <w:color w:val="475569"/>
                 <w:sz w:val="15"/>
               </w:rPr>
               <w:t>+91 9920353532</w:t>
@@ -122,7 +122,7 @@
             <w:r>
               <w:rPr>
                 <w:b/>
-                <w:color w:val="FFFFFF"/>
+                <w:color w:val="4F46E5"/>
                 <w:sz w:val="19"/>
               </w:rPr>
               <w:t>LINKS</w:t>
@@ -168,7 +168,7 @@
             <w:r>
               <w:rPr>
                 <w:b/>
-                <w:color w:val="FFFFFF"/>
+                <w:color w:val="4F46E5"/>
                 <w:sz w:val="19"/>
               </w:rPr>
               <w:t>SKILL FOCUS</w:t>
@@ -177,7 +177,7 @@
           <w:p>
             <w:r>
               <w:rPr>
-                <w:color w:val="FFFFFF"/>
+                <w:color w:val="0F172A"/>
                 <w:sz w:val="15"/>
               </w:rPr>
               <w:t>Angular</w:t>
@@ -195,7 +195,7 @@
           <w:p>
             <w:r>
               <w:rPr>
-                <w:color w:val="FFFFFF"/>
+                <w:color w:val="0F172A"/>
                 <w:sz w:val="15"/>
               </w:rPr>
               <w:t>TypeScript</w:t>
@@ -213,7 +213,7 @@
           <w:p>
             <w:r>
               <w:rPr>
-                <w:color w:val="FFFFFF"/>
+                <w:color w:val="0F172A"/>
                 <w:sz w:val="15"/>
               </w:rPr>
               <w:t>Frontend Architecture</w:t>
@@ -231,7 +231,7 @@
           <w:p>
             <w:r>
               <w:rPr>
-                <w:color w:val="FFFFFF"/>
+                <w:color w:val="0F172A"/>
                 <w:sz w:val="15"/>
               </w:rPr>
               <w:t>AI Copilots</w:t>
@@ -249,7 +249,7 @@
           <w:p>
             <w:r>
               <w:rPr>
-                <w:color w:val="FFFFFF"/>
+                <w:color w:val="0F172A"/>
                 <w:sz w:val="15"/>
               </w:rPr>
               <w:t>RAG / LLM Apps</w:t>
@@ -267,7 +267,7 @@
           <w:p>
             <w:r>
               <w:rPr>
-                <w:color w:val="FFFFFF"/>
+                <w:color w:val="0F172A"/>
                 <w:sz w:val="15"/>
               </w:rPr>
               <w:t>Cloud Delivery</w:t>
@@ -289,7 +289,7 @@
             <w:r>
               <w:rPr>
                 <w:b/>
-                <w:color w:val="FFFFFF"/>
+                <w:color w:val="4F46E5"/>
                 <w:sz w:val="19"/>
               </w:rPr>
               <w:t>ROLE TARGETS</w:t>
@@ -298,7 +298,7 @@
           <w:p>
             <w:r>
               <w:rPr>
-                <w:color w:val="E8EAF0"/>
+                <w:color w:val="475569"/>
                 <w:sz w:val="15"/>
               </w:rPr>
               <w:t>AI Frontend Engineer</w:t>
@@ -307,7 +307,7 @@
           <w:p>
             <w:r>
               <w:rPr>
-                <w:color w:val="E8EAF0"/>
+                <w:color w:val="475569"/>
                 <w:sz w:val="15"/>
               </w:rPr>
               <w:t>Frontend Architect</w:t>
@@ -316,7 +316,7 @@
           <w:p>
             <w:r>
               <w:rPr>
-                <w:color w:val="E8EAF0"/>
+                <w:color w:val="475569"/>
                 <w:sz w:val="15"/>
               </w:rPr>
               <w:t>Angular Architect</w:t>
@@ -325,7 +325,7 @@
           <w:p>
             <w:r>
               <w:rPr>
-                <w:color w:val="E8EAF0"/>
+                <w:color w:val="475569"/>
                 <w:sz w:val="15"/>
               </w:rPr>
               <w:t>Copilot / LLM App Engineer</w:t>
@@ -336,13 +336,13 @@
           <w:tcPr>
             <w:tcW w:type="dxa" w:w="7344"/>
             <w:vAlign w:val="top"/>
-            <w:shd w:fill="121623"/>
+            <w:shd w:fill="FFFFFF"/>
           </w:tcPr>
           <w:p>
             <w:r>
               <w:rPr>
                 <w:b/>
-                <w:color w:val="F8FAFC"/>
+                <w:color w:val="0F172A"/>
                 <w:sz w:val="44"/>
               </w:rPr>
               <w:t>Ankit Parekh</w:t>
@@ -352,7 +352,7 @@
             <w:r>
               <w:rPr>
                 <w:b/>
-                <w:color w:val="C5D4FF"/>
+                <w:color w:val="4F46E5"/>
                 <w:sz w:val="19"/>
               </w:rPr>
               <w:t>AI Frontend Architect - Enterprise Angular | Copilots | UI Agents | LLM Apps</w:t>
@@ -365,7 +365,7 @@
             <w:r>
               <w:rPr>
                 <w:b/>
-                <w:color w:val="5B8CFF"/>
+                <w:color w:val="4F46E5"/>
                 <w:sz w:val="20"/>
               </w:rPr>
               <w:t>PROFILE</w:t>
@@ -374,7 +374,7 @@
           <w:p>
             <w:r>
               <w:rPr>
-                <w:color w:val="E8EAF0"/>
+                <w:color w:val="0F172A"/>
               </w:rPr>
               <w:t>AI Frontend Architect with 18+ years of experience shipping enterprise web products, large Angular and TypeScript applications, and intelligent UI systems. I build AI-native frontend experiences where copilots, RAG, tool execution, and agentic workflows live inside real applications, not beside them.</w:t>
             </w:r>
@@ -386,7 +386,7 @@
             </w:pPr>
             <w:r>
               <w:rPr>
-                <w:color w:val="E8EAF0"/>
+                <w:color w:val="0F172A"/>
               </w:rPr>
               <w:t>Architect large Angular platforms with clear module boundaries, reusable UI patterns, and long-term ownership.</w:t>
             </w:r>
@@ -398,7 +398,7 @@
             </w:pPr>
             <w:r>
               <w:rPr>
-                <w:color w:val="E8EAF0"/>
+                <w:color w:val="0F172A"/>
               </w:rPr>
               <w:t>Design embedded copilots that understand product context, retrieve grounded answers, and execute workflow actions.</w:t>
             </w:r>
@@ -410,7 +410,7 @@
             </w:pPr>
             <w:r>
               <w:rPr>
-                <w:color w:val="E8EAF0"/>
+                <w:color w:val="0F172A"/>
               </w:rPr>
               <w:t>Turn complex enterprise workflows into usable interfaces across dense forms, tables, dashboards, and operational UI.</w:t>
             </w:r>
@@ -422,7 +422,7 @@
             </w:pPr>
             <w:r>
               <w:rPr>
-                <w:color w:val="E8EAF0"/>
+                <w:color w:val="0F172A"/>
               </w:rPr>
               <w:t>Lead delivery across product, frontend, DevOps, and platform teams with production sustainment discipline.</w:t>
             </w:r>
@@ -434,7 +434,7 @@
             <w:r>
               <w:rPr>
                 <w:b/>
-                <w:color w:val="5B8CFF"/>
+                <w:color w:val="4F46E5"/>
                 <w:sz w:val="20"/>
               </w:rPr>
               <w:t>AI FRONTEND WORK</w:t>
@@ -447,7 +447,7 @@
             <w:r>
               <w:rPr>
                 <w:b/>
-                <w:color w:val="E8EAF0"/>
+                <w:color w:val="0F172A"/>
               </w:rPr>
               <w:t>Embedded Copilot for Enterprise Apps</w:t>
             </w:r>
@@ -459,7 +459,7 @@
             </w:pPr>
             <w:r>
               <w:rPr>
-                <w:color w:val="E8EAF0"/>
+                <w:color w:val="0F172A"/>
               </w:rPr>
               <w:t>Copilot concept for Angular and web apps that understands routes, selected records, forms, DOM context, and user intent.</w:t>
             </w:r>
@@ -471,7 +471,7 @@
             </w:pPr>
             <w:r>
               <w:rPr>
-                <w:color w:val="E8EAF0"/>
+                <w:color w:val="0F172A"/>
               </w:rPr>
               <w:t>Multi-agent modes for plan, execute, debug, and ask workflows.</w:t>
             </w:r>
@@ -483,7 +483,7 @@
             </w:pPr>
             <w:r>
               <w:rPr>
-                <w:color w:val="E8EAF0"/>
+                <w:color w:val="0F172A"/>
               </w:rPr>
               <w:t>RAG across docs, codebase knowledge, APIs, and workflows to ground responses in product context.</w:t>
             </w:r>
@@ -495,7 +495,7 @@
             </w:pPr>
             <w:r>
               <w:rPr>
-                <w:color w:val="E8EAF0"/>
+                <w:color w:val="0F172A"/>
               </w:rPr>
               <w:t>Action execution through APIs, navigation, workflow tools, evaluation loops, retries, and recovery paths.</w:t>
             </w:r>
@@ -507,7 +507,7 @@
             <w:r>
               <w:rPr>
                 <w:b/>
-                <w:color w:val="E8EAF0"/>
+                <w:color w:val="0F172A"/>
               </w:rPr>
               <w:t>Copilot Runtime and SDK Direction</w:t>
             </w:r>
@@ -519,7 +519,7 @@
             </w:pPr>
             <w:r>
               <w:rPr>
-                <w:color w:val="E8EAF0"/>
+                <w:color w:val="0F172A"/>
               </w:rPr>
               <w:t>Reusable architecture for a copilot shell, agent orchestrator, tool registry, ingestion connectors, and enterprise-safe action execution.</w:t>
             </w:r>
@@ -531,7 +531,7 @@
             </w:pPr>
             <w:r>
               <w:rPr>
-                <w:color w:val="E8EAF0"/>
+                <w:color w:val="0F172A"/>
               </w:rPr>
               <w:t>Designed for teams that want AI-native behavior inside Angular and TypeScript products without one-off integrations.</w:t>
             </w:r>
@@ -543,7 +543,7 @@
             <w:r>
               <w:rPr>
                 <w:b/>
-                <w:color w:val="5B8CFF"/>
+                <w:color w:val="4F46E5"/>
                 <w:sz w:val="20"/>
               </w:rPr>
               <w:t>EMPLOYMENT HISTORY</w:t>
@@ -556,13 +556,13 @@
             <w:r>
               <w:rPr>
                 <w:b/>
-                <w:color w:val="E8EAF0"/>
+                <w:color w:val="0F172A"/>
               </w:rPr>
               <w:t>Team Lead, Codifyd</w:t>
             </w:r>
             <w:r>
               <w:rPr>
-                <w:color w:val="E8EAF0"/>
+                <w:color w:val="0F172A"/>
               </w:rPr>
               <w:t xml:space="preserve"> | 2018 - Present</w:t>
             </w:r>
@@ -574,7 +574,7 @@
             </w:pPr>
             <w:r>
               <w:rPr>
-                <w:color w:val="E8EAF0"/>
+                <w:color w:val="0F172A"/>
               </w:rPr>
               <w:t>Own technical direction for enterprise web products, including stack fit, integration contracts, frontend architecture, and delivery trade-offs.</w:t>
             </w:r>
@@ -586,7 +586,7 @@
             </w:pPr>
             <w:r>
               <w:rPr>
-                <w:color w:val="E8EAF0"/>
+                <w:color w:val="0F172A"/>
               </w:rPr>
               <w:t>Define system boundaries for large multi-module web applications and sustain production codebases through refactors, regression control, and release coordination.</w:t>
             </w:r>
@@ -598,7 +598,7 @@
             </w:pPr>
             <w:r>
               <w:rPr>
-                <w:color w:val="E8EAF0"/>
+                <w:color w:val="0F172A"/>
               </w:rPr>
               <w:t>Create wireframes, interaction flows, and reusable UI patterns to align product intent with engineering constraints.</w:t>
             </w:r>
@@ -610,7 +610,7 @@
             </w:pPr>
             <w:r>
               <w:rPr>
-                <w:color w:val="E8EAF0"/>
+                <w:color w:val="0F172A"/>
               </w:rPr>
               <w:t>Partner with DevOps and platform teams on CI/CD, build tooling, environment-specific defects, and cross-stack troubleshooting.</w:t>
             </w:r>
@@ -622,13 +622,13 @@
             <w:r>
               <w:rPr>
                 <w:b/>
-                <w:color w:val="E8EAF0"/>
+                <w:color w:val="0F172A"/>
               </w:rPr>
               <w:t>Front-end Expert, Zooty.in</w:t>
             </w:r>
             <w:r>
               <w:rPr>
-                <w:color w:val="E8EAF0"/>
+                <w:color w:val="0F172A"/>
               </w:rPr>
               <w:t xml:space="preserve"> | 2016 - 2018</w:t>
             </w:r>
@@ -640,7 +640,7 @@
             </w:pPr>
             <w:r>
               <w:rPr>
-                <w:color w:val="E8EAF0"/>
+                <w:color w:val="0F172A"/>
               </w:rPr>
               <w:t>Steered frontend implementation strategy, dependencies, sequencing, and UI architecture for customer-facing web products.</w:t>
             </w:r>
@@ -652,7 +652,7 @@
             </w:pPr>
             <w:r>
               <w:rPr>
-                <w:color w:val="E8EAF0"/>
+                <w:color w:val="0F172A"/>
               </w:rPr>
               <w:t>Designed component boundaries, state ownership, interaction flows, and maintainable UI structure.</w:t>
             </w:r>
@@ -664,7 +664,7 @@
             </w:pPr>
             <w:r>
               <w:rPr>
-                <w:color w:val="E8EAF0"/>
+                <w:color w:val="0F172A"/>
               </w:rPr>
               <w:t>Owned UX outcomes, defect triage, performance hotspots, and incremental hardening of live systems.</w:t>
             </w:r>
@@ -676,13 +676,13 @@
             <w:r>
               <w:rPr>
                 <w:b/>
-                <w:color w:val="E8EAF0"/>
+                <w:color w:val="0F172A"/>
               </w:rPr>
               <w:t>Lead Front-end Programmer, Musafir.com</w:t>
             </w:r>
             <w:r>
               <w:rPr>
-                <w:color w:val="E8EAF0"/>
+                <w:color w:val="0F172A"/>
               </w:rPr>
               <w:t xml:space="preserve"> | 2015 - 2016</w:t>
             </w:r>
@@ -694,7 +694,7 @@
             </w:pPr>
             <w:r>
               <w:rPr>
-                <w:color w:val="E8EAF0"/>
+                <w:color w:val="0F172A"/>
               </w:rPr>
               <w:t>Implemented and reviewed production UI for high-traffic travel workflows including search, pricing, booking, and checkout surfaces.</w:t>
             </w:r>
@@ -706,7 +706,7 @@
             </w:pPr>
             <w:r>
               <w:rPr>
-                <w:color w:val="E8EAF0"/>
+                <w:color w:val="0F172A"/>
               </w:rPr>
               <w:t>Resolved complex rendering, layout, and performance issues under real traffic and data-load conditions.</w:t>
             </w:r>
@@ -718,13 +718,13 @@
             <w:r>
               <w:rPr>
                 <w:b/>
-                <w:color w:val="E8EAF0"/>
+                <w:color w:val="0F172A"/>
               </w:rPr>
               <w:t>Senior Front-end Developer, Verdantis Pvt Ltd.</w:t>
             </w:r>
             <w:r>
               <w:rPr>
-                <w:color w:val="E8EAF0"/>
+                <w:color w:val="0F172A"/>
               </w:rPr>
               <w:t xml:space="preserve"> | 2014 - 2015</w:t>
             </w:r>
@@ -736,7 +736,7 @@
             </w:pPr>
             <w:r>
               <w:rPr>
-                <w:color w:val="E8EAF0"/>
+                <w:color w:val="0F172A"/>
               </w:rPr>
               <w:t>Built data-dense enterprise interfaces with strict validation, forms, tables, and workflow requirements.</w:t>
             </w:r>
@@ -748,7 +748,7 @@
             </w:pPr>
             <w:r>
               <w:rPr>
-                <w:color w:val="E8EAF0"/>
+                <w:color w:val="0F172A"/>
               </w:rPr>
               <w:t>Supported Scrum delivery, browser regression fixes, API/schema-linked UI defects, UAT cycles, and production RCA.</w:t>
             </w:r>
@@ -760,13 +760,13 @@
             <w:r>
               <w:rPr>
                 <w:b/>
-                <w:color w:val="E8EAF0"/>
+                <w:color w:val="0F172A"/>
               </w:rPr>
               <w:t>Frontend / Web Consultant, Capgemini, Efurtherance, E10 InfoTech, Aambit Softwares</w:t>
             </w:r>
             <w:r>
               <w:rPr>
-                <w:color w:val="E8EAF0"/>
+                <w:color w:val="0F172A"/>
               </w:rPr>
               <w:t xml:space="preserve"> | 2012 - 2014</w:t>
             </w:r>
@@ -778,7 +778,7 @@
             </w:pPr>
             <w:r>
               <w:rPr>
-                <w:color w:val="E8EAF0"/>
+                <w:color w:val="0F172A"/>
               </w:rPr>
               <w:t>Delivered frontend modules, layouts, mockups, client checkpoints, bug fixes, and integration support across early client projects.</w:t>
             </w:r>
@@ -803,7 +803,7 @@
       <w:r>
         <w:rPr>
           <w:b/>
-          <w:color w:val="5B8CFF"/>
+          <w:color w:val="4F46E5"/>
           <w:sz w:val="20"/>
         </w:rPr>
         <w:t>TECHNICAL CAPABILITIES</w:t>
@@ -823,7 +823,7 @@
         <w:tc>
           <w:tcPr>
             <w:tcW w:type="dxa" w:w="5328"/>
-            <w:shd w:fill="1B2236"/>
+            <w:shd w:fill="EEF2FF"/>
           </w:tcPr>
           <w:p>
             <w:r>
@@ -849,7 +849,7 @@
         <w:tc>
           <w:tcPr>
             <w:tcW w:type="dxa" w:w="5328"/>
-            <w:shd w:fill="1B2236"/>
+            <w:shd w:fill="EEF2FF"/>
           </w:tcPr>
           <w:p>
             <w:r>
@@ -875,7 +875,7 @@
         <w:tc>
           <w:tcPr>
             <w:tcW w:type="dxa" w:w="5328"/>
-            <w:shd w:fill="1B2236"/>
+            <w:shd w:fill="EEF2FF"/>
           </w:tcPr>
           <w:p>
             <w:r>
@@ -901,7 +901,7 @@
         <w:tc>
           <w:tcPr>
             <w:tcW w:type="dxa" w:w="5328"/>
-            <w:shd w:fill="1B2236"/>
+            <w:shd w:fill="EEF2FF"/>
           </w:tcPr>
           <w:p>
             <w:r>
@@ -927,7 +927,7 @@
         <w:tc>
           <w:tcPr>
             <w:tcW w:type="dxa" w:w="5328"/>
-            <w:shd w:fill="1B2236"/>
+            <w:shd w:fill="EEF2FF"/>
           </w:tcPr>
           <w:p>
             <w:r>
@@ -957,7 +957,7 @@
       <w:r>
         <w:rPr>
           <w:b/>
-          <w:color w:val="5B8CFF"/>
+          <w:color w:val="4F46E5"/>
           <w:sz w:val="20"/>
         </w:rPr>
         <w:t>PRODUCTION DOMAINS</w:t>
@@ -997,7 +997,7 @@
       <w:r>
         <w:rPr>
           <w:b/>
-          <w:color w:val="5B8CFF"/>
+          <w:color w:val="4F46E5"/>
           <w:sz w:val="20"/>
         </w:rPr>
         <w:t>EDUCATION</w:t>
@@ -1028,7 +1028,7 @@
       <w:r>
         <w:rPr>
           <w:b/>
-          <w:color w:val="5B8CFF"/>
+          <w:color w:val="4F46E5"/>
           <w:sz w:val="20"/>
         </w:rPr>
         <w:t>PUBLIC PROOF</w:t>

</xml_diff>

<commit_message>
Fix technical capabilities table layout
</commit_message>
<xml_diff>
--- a/AnkitParekh_Resume.docx
+++ b/AnkitParekh_Resume.docx
@@ -813,6 +813,7 @@
       <w:tblPr>
         <w:tblStyle w:val="TableGrid"/>
         <w:tblW w:type="auto" w:w="0"/>
+        <w:tblLayout w:type="fixed"/>
         <w:tblLook w:firstColumn="1" w:firstRow="1" w:lastColumn="0" w:lastRow="0" w:noHBand="0" w:noVBand="1" w:val="04A0"/>
       </w:tblPr>
       <w:tblGrid>
@@ -822,13 +823,17 @@
       <w:tr>
         <w:tc>
           <w:tcPr>
-            <w:tcW w:type="dxa" w:w="5328"/>
+            <w:tcW w:type="dxa" w:w="1700"/>
             <w:shd w:fill="EEF2FF"/>
           </w:tcPr>
           <w:p>
+            <w:pPr>
+              <w:spacing w:after="0"/>
+            </w:pPr>
             <w:r>
               <w:rPr>
                 <w:b/>
+                <w:sz w:val="16"/>
               </w:rPr>
               <w:t>Frontend</w:t>
             </w:r>
@@ -836,10 +841,16 @@
         </w:tc>
         <w:tc>
           <w:tcPr>
-            <w:tcW w:type="dxa" w:w="5328"/>
+            <w:tcW w:type="dxa" w:w="6500"/>
           </w:tcPr>
           <w:p>
+            <w:pPr>
+              <w:spacing w:after="0"/>
+            </w:pPr>
             <w:r>
+              <w:rPr>
+                <w:sz w:val="16"/>
+              </w:rPr>
               <w:t>Angular, TypeScript, RxJS, JavaScript, HTML5, CSS3, Sass, React</w:t>
             </w:r>
           </w:p>
@@ -848,13 +859,17 @@
       <w:tr>
         <w:tc>
           <w:tcPr>
-            <w:tcW w:type="dxa" w:w="5328"/>
+            <w:tcW w:type="dxa" w:w="1700"/>
             <w:shd w:fill="EEF2FF"/>
           </w:tcPr>
           <w:p>
+            <w:pPr>
+              <w:spacing w:after="0"/>
+            </w:pPr>
             <w:r>
               <w:rPr>
                 <w:b/>
+                <w:sz w:val="16"/>
               </w:rPr>
               <w:t>AI / LLM</w:t>
             </w:r>
@@ -862,10 +877,16 @@
         </w:tc>
         <w:tc>
           <w:tcPr>
-            <w:tcW w:type="dxa" w:w="5328"/>
+            <w:tcW w:type="dxa" w:w="6500"/>
           </w:tcPr>
           <w:p>
+            <w:pPr>
+              <w:spacing w:after="0"/>
+            </w:pPr>
             <w:r>
+              <w:rPr>
+                <w:sz w:val="16"/>
+              </w:rPr>
               <w:t>Copilots, RAG, AI agents, tool calling, streaming UX, prompt flows, guardrails</w:t>
             </w:r>
           </w:p>
@@ -874,13 +895,17 @@
       <w:tr>
         <w:tc>
           <w:tcPr>
-            <w:tcW w:type="dxa" w:w="5328"/>
+            <w:tcW w:type="dxa" w:w="1700"/>
             <w:shd w:fill="EEF2FF"/>
           </w:tcPr>
           <w:p>
+            <w:pPr>
+              <w:spacing w:after="0"/>
+            </w:pPr>
             <w:r>
               <w:rPr>
                 <w:b/>
+                <w:sz w:val="16"/>
               </w:rPr>
               <w:t>Architecture</w:t>
             </w:r>
@@ -888,10 +913,16 @@
         </w:tc>
         <w:tc>
           <w:tcPr>
-            <w:tcW w:type="dxa" w:w="5328"/>
+            <w:tcW w:type="dxa" w:w="6500"/>
           </w:tcPr>
           <w:p>
+            <w:pPr>
+              <w:spacing w:after="0"/>
+            </w:pPr>
             <w:r>
+              <w:rPr>
+                <w:sz w:val="16"/>
+              </w:rPr>
               <w:t>Enterprise UI platforms, modular systems, design systems, state ownership</w:t>
             </w:r>
           </w:p>
@@ -900,13 +931,17 @@
       <w:tr>
         <w:tc>
           <w:tcPr>
-            <w:tcW w:type="dxa" w:w="5328"/>
+            <w:tcW w:type="dxa" w:w="1700"/>
             <w:shd w:fill="EEF2FF"/>
           </w:tcPr>
           <w:p>
+            <w:pPr>
+              <w:spacing w:after="0"/>
+            </w:pPr>
             <w:r>
               <w:rPr>
                 <w:b/>
+                <w:sz w:val="16"/>
               </w:rPr>
               <w:t>Cloud</w:t>
             </w:r>
@@ -914,10 +949,16 @@
         </w:tc>
         <w:tc>
           <w:tcPr>
-            <w:tcW w:type="dxa" w:w="5328"/>
+            <w:tcW w:type="dxa" w:w="6500"/>
           </w:tcPr>
           <w:p>
+            <w:pPr>
+              <w:spacing w:after="0"/>
+            </w:pPr>
             <w:r>
+              <w:rPr>
+                <w:sz w:val="16"/>
+              </w:rPr>
               <w:t>AWS, Docker, Kubernetes, Jenkins, CI/CD</w:t>
             </w:r>
           </w:p>
@@ -926,13 +967,17 @@
       <w:tr>
         <w:tc>
           <w:tcPr>
-            <w:tcW w:type="dxa" w:w="5328"/>
+            <w:tcW w:type="dxa" w:w="1700"/>
             <w:shd w:fill="EEF2FF"/>
           </w:tcPr>
           <w:p>
+            <w:pPr>
+              <w:spacing w:after="0"/>
+            </w:pPr>
             <w:r>
               <w:rPr>
                 <w:b/>
+                <w:sz w:val="16"/>
               </w:rPr>
               <w:t>Backend</w:t>
             </w:r>
@@ -940,10 +985,16 @@
         </w:tc>
         <w:tc>
           <w:tcPr>
-            <w:tcW w:type="dxa" w:w="5328"/>
+            <w:tcW w:type="dxa" w:w="6500"/>
           </w:tcPr>
           <w:p>
+            <w:pPr>
+              <w:spacing w:after="0"/>
+            </w:pPr>
             <w:r>
+              <w:rPr>
+                <w:sz w:val="16"/>
+              </w:rPr>
               <w:t>Node.js, Express.js, Python</w:t>
             </w:r>
           </w:p>

</xml_diff>